<commit_message>
Tugas MySQL pak Isa
</commit_message>
<xml_diff>
--- a/Tugas Tambahan/Pengerjaan Tugas Tambahan MySQL.docx
+++ b/Tugas Tambahan/Pengerjaan Tugas Tambahan MySQL.docx
@@ -141,6 +141,76 @@
           <w:szCs w:val="24"/>
         </w:rPr>
       </w:pPr>
+    </w:p>
+    <w:p>
+      <w:pPr>
+        <w:jc w:val="center"/>
+        <w:rPr>
+          <w:rFonts w:ascii="Times New Roman" w:hAnsi="Times New Roman" w:cs="Times New Roman"/>
+          <w:sz w:val="24"/>
+          <w:szCs w:val="24"/>
+        </w:rPr>
+      </w:pPr>
+    </w:p>
+    <w:p>
+      <w:pPr>
+        <w:jc w:val="center"/>
+        <w:rPr>
+          <w:rFonts w:ascii="Times New Roman" w:hAnsi="Times New Roman" w:cs="Times New Roman"/>
+          <w:sz w:val="24"/>
+          <w:szCs w:val="24"/>
+        </w:rPr>
+      </w:pPr>
+    </w:p>
+    <w:p>
+      <w:pPr>
+        <w:jc w:val="center"/>
+        <w:rPr>
+          <w:rFonts w:ascii="Times New Roman" w:hAnsi="Times New Roman" w:cs="Times New Roman"/>
+          <w:sz w:val="24"/>
+          <w:szCs w:val="24"/>
+        </w:rPr>
+      </w:pPr>
+    </w:p>
+    <w:p>
+      <w:pPr>
+        <w:jc w:val="center"/>
+        <w:rPr>
+          <w:rFonts w:ascii="Times New Roman" w:hAnsi="Times New Roman" w:cs="Times New Roman"/>
+          <w:sz w:val="24"/>
+          <w:szCs w:val="24"/>
+        </w:rPr>
+      </w:pPr>
+    </w:p>
+    <w:p>
+      <w:pPr>
+        <w:jc w:val="center"/>
+        <w:rPr>
+          <w:rFonts w:ascii="Times New Roman" w:hAnsi="Times New Roman" w:cs="Times New Roman"/>
+          <w:sz w:val="24"/>
+          <w:szCs w:val="24"/>
+        </w:rPr>
+      </w:pPr>
+    </w:p>
+    <w:p>
+      <w:pPr>
+        <w:jc w:val="center"/>
+        <w:rPr>
+          <w:rFonts w:ascii="Times New Roman" w:hAnsi="Times New Roman" w:cs="Times New Roman"/>
+          <w:sz w:val="24"/>
+          <w:szCs w:val="24"/>
+        </w:rPr>
+      </w:pPr>
+    </w:p>
+    <w:p>
+      <w:pPr>
+        <w:jc w:val="center"/>
+        <w:rPr>
+          <w:rFonts w:ascii="Times New Roman" w:hAnsi="Times New Roman" w:cs="Times New Roman"/>
+          <w:sz w:val="24"/>
+          <w:szCs w:val="24"/>
+        </w:rPr>
+      </w:pPr>
       <w:r>
         <w:rPr>
           <w:rFonts w:ascii="Times New Roman" w:hAnsi="Times New Roman" w:cs="Times New Roman"/>
@@ -201,74 +271,16 @@
           <w:sz w:val="24"/>
           <w:szCs w:val="24"/>
         </w:rPr>
-        <w:t>Kelas: X-RPL</w:t>
-      </w:r>
-    </w:p>
-    <w:p>
-      <w:pPr>
-        <w:jc w:val="center"/>
-        <w:rPr>
-          <w:rFonts w:ascii="Times New Roman" w:hAnsi="Times New Roman" w:cs="Times New Roman"/>
-          <w:sz w:val="24"/>
-          <w:szCs w:val="24"/>
-        </w:rPr>
-      </w:pPr>
-    </w:p>
-    <w:p>
-      <w:pPr>
-        <w:jc w:val="center"/>
-        <w:rPr>
-          <w:rFonts w:ascii="Times New Roman" w:hAnsi="Times New Roman" w:cs="Times New Roman"/>
-          <w:sz w:val="24"/>
-          <w:szCs w:val="24"/>
-        </w:rPr>
-      </w:pPr>
-    </w:p>
-    <w:p>
-      <w:pPr>
-        <w:jc w:val="center"/>
-        <w:rPr>
-          <w:rFonts w:ascii="Times New Roman" w:hAnsi="Times New Roman" w:cs="Times New Roman"/>
-          <w:sz w:val="24"/>
-          <w:szCs w:val="24"/>
-        </w:rPr>
-      </w:pPr>
-    </w:p>
-    <w:p>
-      <w:pPr>
-        <w:rPr>
-          <w:rFonts w:ascii="Times New Roman" w:hAnsi="Times New Roman" w:cs="Times New Roman"/>
-          <w:sz w:val="24"/>
-          <w:szCs w:val="24"/>
-        </w:rPr>
-      </w:pPr>
-    </w:p>
-    <w:p>
-      <w:pPr>
-        <w:rPr>
-          <w:rFonts w:ascii="Times New Roman" w:hAnsi="Times New Roman" w:cs="Times New Roman"/>
-          <w:sz w:val="24"/>
-          <w:szCs w:val="24"/>
-        </w:rPr>
-      </w:pPr>
-    </w:p>
-    <w:p>
-      <w:pPr>
-        <w:rPr>
-          <w:rFonts w:ascii="Times New Roman" w:hAnsi="Times New Roman" w:cs="Times New Roman"/>
-          <w:sz w:val="24"/>
-          <w:szCs w:val="24"/>
-        </w:rPr>
-      </w:pPr>
-    </w:p>
-    <w:p>
-      <w:pPr>
-        <w:rPr>
-          <w:rFonts w:ascii="Times New Roman" w:hAnsi="Times New Roman" w:cs="Times New Roman"/>
-          <w:sz w:val="24"/>
-          <w:szCs w:val="24"/>
-        </w:rPr>
-      </w:pPr>
+        <w:t>Kelas: X-RP</w:t>
+      </w:r>
+      <w:r>
+        <w:rPr>
+          <w:rFonts w:ascii="Times New Roman" w:hAnsi="Times New Roman" w:cs="Times New Roman"/>
+          <w:sz w:val="24"/>
+          <w:szCs w:val="24"/>
+        </w:rPr>
+        <w:t>L</w:t>
+      </w:r>
     </w:p>
     <w:p>
       <w:pPr>
@@ -3071,12 +3083,2545 @@
       <w:pPr>
         <w:rPr>
           <w:rFonts w:ascii="Times New Roman" w:hAnsi="Times New Roman" w:cs="Times New Roman"/>
-          <w:b/>
-          <w:bCs/>
-          <w:sz w:val="28"/>
-          <w:szCs w:val="28"/>
-        </w:rPr>
-      </w:pPr>
+          <w:sz w:val="24"/>
+          <w:szCs w:val="24"/>
+        </w:rPr>
+      </w:pPr>
+      <w:r>
+        <w:rPr>
+          <w:rFonts w:ascii="Times New Roman" w:hAnsi="Times New Roman" w:cs="Times New Roman"/>
+          <w:sz w:val="24"/>
+          <w:szCs w:val="24"/>
+        </w:rPr>
+        <w:drawing>
+          <wp:inline distT="0" distB="0" distL="0" distR="0">
+            <wp:extent cx="5731510" cy="2388870"/>
+            <wp:effectExtent l="0" t="0" r="2540" b="0"/>
+            <wp:docPr id="1869387264" name="Picture 4"/>
+            <wp:cNvGraphicFramePr>
+              <a:graphicFrameLocks xmlns:a="http://schemas.openxmlformats.org/drawingml/2006/main" noChangeAspect="1"/>
+            </wp:cNvGraphicFramePr>
+            <a:graphic xmlns:a="http://schemas.openxmlformats.org/drawingml/2006/main">
+              <a:graphicData uri="http://schemas.openxmlformats.org/drawingml/2006/picture">
+                <pic:pic xmlns:pic="http://schemas.openxmlformats.org/drawingml/2006/picture">
+                  <pic:nvPicPr>
+                    <pic:cNvPr id="1869387264" name="Picture 1869387264"/>
+                    <pic:cNvPicPr/>
+                  </pic:nvPicPr>
+                  <pic:blipFill>
+                    <a:blip r:embed="rId31">
+                      <a:extLst>
+                        <a:ext uri="{28A0092B-C50C-407E-A947-70E740481C1C}">
+                          <a14:useLocalDpi xmlns:a14="http://schemas.microsoft.com/office/drawing/2010/main" val="0"/>
+                        </a:ext>
+                      </a:extLst>
+                    </a:blip>
+                    <a:stretch>
+                      <a:fillRect/>
+                    </a:stretch>
+                  </pic:blipFill>
+                  <pic:spPr>
+                    <a:xfrm>
+                      <a:off x="0" y="0"/>
+                      <a:ext cx="5731510" cy="2388870"/>
+                    </a:xfrm>
+                    <a:prstGeom prst="rect">
+                      <a:avLst/>
+                    </a:prstGeom>
+                  </pic:spPr>
+                </pic:pic>
+              </a:graphicData>
+            </a:graphic>
+          </wp:inline>
+        </w:drawing>
+      </w:r>
+    </w:p>
+    <w:p>
+      <w:pPr>
+        <w:rPr>
+          <w:rFonts w:ascii="Times New Roman" w:hAnsi="Times New Roman" w:cs="Times New Roman"/>
+          <w:sz w:val="24"/>
+          <w:szCs w:val="24"/>
+        </w:rPr>
+      </w:pPr>
+      <w:r>
+        <w:rPr>
+          <w:rFonts w:ascii="Times New Roman" w:hAnsi="Times New Roman" w:cs="Times New Roman"/>
+          <w:sz w:val="24"/>
+          <w:szCs w:val="24"/>
+        </w:rPr>
+        <w:t>Dimana struktur tabel tersebut sama seperti pada MySQL:</w:t>
+      </w:r>
+    </w:p>
+    <w:p>
+      <w:pPr>
+        <w:rPr>
+          <w:rFonts w:ascii="Times New Roman" w:hAnsi="Times New Roman" w:cs="Times New Roman"/>
+          <w:sz w:val="24"/>
+          <w:szCs w:val="24"/>
+        </w:rPr>
+      </w:pPr>
+      <w:r>
+        <w:rPr>
+          <w:rFonts w:ascii="Times New Roman" w:hAnsi="Times New Roman" w:cs="Times New Roman"/>
+          <w:sz w:val="24"/>
+          <w:szCs w:val="24"/>
+        </w:rPr>
+        <w:lastRenderedPageBreak/>
+        <w:drawing>
+          <wp:inline distT="0" distB="0" distL="0" distR="0">
+            <wp:extent cx="5731510" cy="2194560"/>
+            <wp:effectExtent l="0" t="0" r="2540" b="0"/>
+            <wp:docPr id="1128177745" name="Picture 5"/>
+            <wp:cNvGraphicFramePr>
+              <a:graphicFrameLocks xmlns:a="http://schemas.openxmlformats.org/drawingml/2006/main" noChangeAspect="1"/>
+            </wp:cNvGraphicFramePr>
+            <a:graphic xmlns:a="http://schemas.openxmlformats.org/drawingml/2006/main">
+              <a:graphicData uri="http://schemas.openxmlformats.org/drawingml/2006/picture">
+                <pic:pic xmlns:pic="http://schemas.openxmlformats.org/drawingml/2006/picture">
+                  <pic:nvPicPr>
+                    <pic:cNvPr id="1128177745" name="Picture 1128177745"/>
+                    <pic:cNvPicPr/>
+                  </pic:nvPicPr>
+                  <pic:blipFill>
+                    <a:blip r:embed="rId32" cstate="print">
+                      <a:extLst>
+                        <a:ext uri="{28A0092B-C50C-407E-A947-70E740481C1C}">
+                          <a14:useLocalDpi xmlns:a14="http://schemas.microsoft.com/office/drawing/2010/main" val="0"/>
+                        </a:ext>
+                      </a:extLst>
+                    </a:blip>
+                    <a:stretch>
+                      <a:fillRect/>
+                    </a:stretch>
+                  </pic:blipFill>
+                  <pic:spPr>
+                    <a:xfrm>
+                      <a:off x="0" y="0"/>
+                      <a:ext cx="5731510" cy="2194560"/>
+                    </a:xfrm>
+                    <a:prstGeom prst="rect">
+                      <a:avLst/>
+                    </a:prstGeom>
+                  </pic:spPr>
+                </pic:pic>
+              </a:graphicData>
+            </a:graphic>
+          </wp:inline>
+        </w:drawing>
+      </w:r>
+    </w:p>
+    <w:p>
+      <w:pPr>
+        <w:rPr>
+          <w:rFonts w:ascii="Times New Roman" w:hAnsi="Times New Roman" w:cs="Times New Roman"/>
+          <w:sz w:val="24"/>
+          <w:szCs w:val="24"/>
+        </w:rPr>
+      </w:pPr>
+    </w:p>
+    <w:p>
+      <w:pPr>
+        <w:rPr>
+          <w:rFonts w:ascii="Times New Roman" w:hAnsi="Times New Roman" w:cs="Times New Roman"/>
+          <w:b/>
+          <w:bCs/>
+          <w:sz w:val="24"/>
+          <w:szCs w:val="24"/>
+          <w:u w:val="single"/>
+        </w:rPr>
+      </w:pPr>
+      <w:r>
+        <w:rPr>
+          <w:rFonts w:ascii="Times New Roman" w:hAnsi="Times New Roman" w:cs="Times New Roman"/>
+          <w:b/>
+          <w:bCs/>
+          <w:sz w:val="24"/>
+          <w:szCs w:val="24"/>
+          <w:u w:val="single"/>
+        </w:rPr>
+        <w:t>Membuat Tabel tblbarang</w:t>
+      </w:r>
+    </w:p>
+    <w:p>
+      <w:pPr>
+        <w:rPr>
+          <w:rFonts w:ascii="Times New Roman" w:hAnsi="Times New Roman" w:cs="Times New Roman"/>
+          <w:sz w:val="24"/>
+          <w:szCs w:val="24"/>
+        </w:rPr>
+      </w:pPr>
+      <w:r>
+        <w:rPr>
+          <w:rFonts w:ascii="Times New Roman" w:hAnsi="Times New Roman" w:cs="Times New Roman"/>
+          <w:sz w:val="24"/>
+          <w:szCs w:val="24"/>
+        </w:rPr>
+        <w:drawing>
+          <wp:inline distT="0" distB="0" distL="0" distR="0">
+            <wp:extent cx="5731510" cy="2510790"/>
+            <wp:effectExtent l="0" t="0" r="2540" b="3810"/>
+            <wp:docPr id="1948827570" name="Picture 4"/>
+            <wp:cNvGraphicFramePr>
+              <a:graphicFrameLocks xmlns:a="http://schemas.openxmlformats.org/drawingml/2006/main" noChangeAspect="1"/>
+            </wp:cNvGraphicFramePr>
+            <a:graphic xmlns:a="http://schemas.openxmlformats.org/drawingml/2006/main">
+              <a:graphicData uri="http://schemas.openxmlformats.org/drawingml/2006/picture">
+                <pic:pic xmlns:pic="http://schemas.openxmlformats.org/drawingml/2006/picture">
+                  <pic:nvPicPr>
+                    <pic:cNvPr id="1948827570" name="Picture 1948827570"/>
+                    <pic:cNvPicPr/>
+                  </pic:nvPicPr>
+                  <pic:blipFill>
+                    <a:blip r:embed="rId33">
+                      <a:extLst>
+                        <a:ext uri="{28A0092B-C50C-407E-A947-70E740481C1C}">
+                          <a14:useLocalDpi xmlns:a14="http://schemas.microsoft.com/office/drawing/2010/main" val="0"/>
+                        </a:ext>
+                      </a:extLst>
+                    </a:blip>
+                    <a:stretch>
+                      <a:fillRect/>
+                    </a:stretch>
+                  </pic:blipFill>
+                  <pic:spPr>
+                    <a:xfrm>
+                      <a:off x="0" y="0"/>
+                      <a:ext cx="5731510" cy="2510790"/>
+                    </a:xfrm>
+                    <a:prstGeom prst="rect">
+                      <a:avLst/>
+                    </a:prstGeom>
+                  </pic:spPr>
+                </pic:pic>
+              </a:graphicData>
+            </a:graphic>
+          </wp:inline>
+        </w:drawing>
+      </w:r>
+    </w:p>
+    <w:p>
+      <w:pPr>
+        <w:rPr>
+          <w:rFonts w:ascii="Times New Roman" w:hAnsi="Times New Roman" w:cs="Times New Roman"/>
+          <w:b/>
+          <w:bCs/>
+          <w:sz w:val="24"/>
+          <w:szCs w:val="24"/>
+        </w:rPr>
+      </w:pPr>
+      <w:r>
+        <w:rPr>
+          <w:rFonts w:ascii="Times New Roman" w:hAnsi="Times New Roman" w:cs="Times New Roman"/>
+          <w:b/>
+          <w:bCs/>
+          <w:sz w:val="24"/>
+          <w:szCs w:val="24"/>
+        </w:rPr>
+        <w:t>Menampilkan Tabel</w:t>
+      </w:r>
+    </w:p>
+    <w:p>
+      <w:pPr>
+        <w:rPr>
+          <w:rFonts w:ascii="Times New Roman" w:hAnsi="Times New Roman" w:cs="Times New Roman"/>
+          <w:b/>
+          <w:bCs/>
+          <w:sz w:val="24"/>
+          <w:szCs w:val="24"/>
+        </w:rPr>
+      </w:pPr>
+      <w:r>
+        <w:rPr>
+          <w:rFonts w:ascii="Times New Roman" w:hAnsi="Times New Roman" w:cs="Times New Roman"/>
+          <w:b/>
+          <w:bCs/>
+          <w:sz w:val="24"/>
+          <w:szCs w:val="24"/>
+        </w:rPr>
+        <w:drawing>
+          <wp:inline distT="0" distB="0" distL="0" distR="0">
+            <wp:extent cx="5232669" cy="2184512"/>
+            <wp:effectExtent l="0" t="0" r="6350" b="6350"/>
+            <wp:docPr id="1055453777" name="Picture 5"/>
+            <wp:cNvGraphicFramePr>
+              <a:graphicFrameLocks xmlns:a="http://schemas.openxmlformats.org/drawingml/2006/main" noChangeAspect="1"/>
+            </wp:cNvGraphicFramePr>
+            <a:graphic xmlns:a="http://schemas.openxmlformats.org/drawingml/2006/main">
+              <a:graphicData uri="http://schemas.openxmlformats.org/drawingml/2006/picture">
+                <pic:pic xmlns:pic="http://schemas.openxmlformats.org/drawingml/2006/picture">
+                  <pic:nvPicPr>
+                    <pic:cNvPr id="1055453777" name="Picture 1055453777"/>
+                    <pic:cNvPicPr/>
+                  </pic:nvPicPr>
+                  <pic:blipFill>
+                    <a:blip r:embed="rId34">
+                      <a:extLst>
+                        <a:ext uri="{28A0092B-C50C-407E-A947-70E740481C1C}">
+                          <a14:useLocalDpi xmlns:a14="http://schemas.microsoft.com/office/drawing/2010/main" val="0"/>
+                        </a:ext>
+                      </a:extLst>
+                    </a:blip>
+                    <a:stretch>
+                      <a:fillRect/>
+                    </a:stretch>
+                  </pic:blipFill>
+                  <pic:spPr>
+                    <a:xfrm>
+                      <a:off x="0" y="0"/>
+                      <a:ext cx="5232669" cy="2184512"/>
+                    </a:xfrm>
+                    <a:prstGeom prst="rect">
+                      <a:avLst/>
+                    </a:prstGeom>
+                  </pic:spPr>
+                </pic:pic>
+              </a:graphicData>
+            </a:graphic>
+          </wp:inline>
+        </w:drawing>
+      </w:r>
+    </w:p>
+    <w:p>
+      <w:pPr>
+        <w:rPr>
+          <w:rFonts w:ascii="Times New Roman" w:hAnsi="Times New Roman" w:cs="Times New Roman"/>
+          <w:b/>
+          <w:bCs/>
+          <w:sz w:val="24"/>
+          <w:szCs w:val="24"/>
+        </w:rPr>
+      </w:pPr>
+    </w:p>
+    <w:p>
+      <w:pPr>
+        <w:rPr>
+          <w:rFonts w:ascii="Times New Roman" w:hAnsi="Times New Roman" w:cs="Times New Roman"/>
+          <w:b/>
+          <w:bCs/>
+          <w:sz w:val="28"/>
+          <w:szCs w:val="28"/>
+        </w:rPr>
+      </w:pPr>
+      <w:r>
+        <w:rPr>
+          <w:rFonts w:ascii="Times New Roman" w:hAnsi="Times New Roman" w:cs="Times New Roman"/>
+          <w:b/>
+          <w:bCs/>
+          <w:sz w:val="28"/>
+          <w:szCs w:val="28"/>
+        </w:rPr>
+        <w:t>Menambah Kolom</w:t>
+      </w:r>
+    </w:p>
+    <w:p>
+      <w:pPr>
+        <w:rPr>
+          <w:rFonts w:ascii="Times New Roman" w:hAnsi="Times New Roman" w:cs="Times New Roman"/>
+          <w:sz w:val="24"/>
+          <w:szCs w:val="24"/>
+        </w:rPr>
+      </w:pPr>
+      <w:r>
+        <w:rPr>
+          <w:rFonts w:ascii="Times New Roman" w:hAnsi="Times New Roman" w:cs="Times New Roman"/>
+          <w:sz w:val="24"/>
+          <w:szCs w:val="24"/>
+        </w:rPr>
+        <w:lastRenderedPageBreak/>
+        <w:t>Menambahkan kolom baru:</w:t>
+      </w:r>
+    </w:p>
+    <w:p>
+      <w:pPr>
+        <w:rPr>
+          <w:rFonts w:ascii="Times New Roman" w:hAnsi="Times New Roman" w:cs="Times New Roman"/>
+          <w:b/>
+          <w:bCs/>
+          <w:sz w:val="28"/>
+          <w:szCs w:val="28"/>
+        </w:rPr>
+      </w:pPr>
+      <w:r>
+        <w:rPr>
+          <w:rFonts w:ascii="Times New Roman" w:hAnsi="Times New Roman" w:cs="Times New Roman"/>
+          <w:b/>
+          <w:bCs/>
+          <w:sz w:val="28"/>
+          <w:szCs w:val="28"/>
+        </w:rPr>
+        <w:drawing>
+          <wp:inline distT="0" distB="0" distL="0" distR="0">
+            <wp:extent cx="5232669" cy="2241665"/>
+            <wp:effectExtent l="0" t="0" r="6350" b="6350"/>
+            <wp:docPr id="1187818628" name="Picture 6"/>
+            <wp:cNvGraphicFramePr>
+              <a:graphicFrameLocks xmlns:a="http://schemas.openxmlformats.org/drawingml/2006/main" noChangeAspect="1"/>
+            </wp:cNvGraphicFramePr>
+            <a:graphic xmlns:a="http://schemas.openxmlformats.org/drawingml/2006/main">
+              <a:graphicData uri="http://schemas.openxmlformats.org/drawingml/2006/picture">
+                <pic:pic xmlns:pic="http://schemas.openxmlformats.org/drawingml/2006/picture">
+                  <pic:nvPicPr>
+                    <pic:cNvPr id="1187818628" name="Picture 1187818628"/>
+                    <pic:cNvPicPr/>
+                  </pic:nvPicPr>
+                  <pic:blipFill>
+                    <a:blip r:embed="rId35">
+                      <a:extLst>
+                        <a:ext uri="{28A0092B-C50C-407E-A947-70E740481C1C}">
+                          <a14:useLocalDpi xmlns:a14="http://schemas.microsoft.com/office/drawing/2010/main" val="0"/>
+                        </a:ext>
+                      </a:extLst>
+                    </a:blip>
+                    <a:stretch>
+                      <a:fillRect/>
+                    </a:stretch>
+                  </pic:blipFill>
+                  <pic:spPr>
+                    <a:xfrm>
+                      <a:off x="0" y="0"/>
+                      <a:ext cx="5232669" cy="2241665"/>
+                    </a:xfrm>
+                    <a:prstGeom prst="rect">
+                      <a:avLst/>
+                    </a:prstGeom>
+                  </pic:spPr>
+                </pic:pic>
+              </a:graphicData>
+            </a:graphic>
+          </wp:inline>
+        </w:drawing>
+      </w:r>
+    </w:p>
+    <w:p>
+      <w:pPr>
+        <w:rPr>
+          <w:rFonts w:ascii="Times New Roman" w:hAnsi="Times New Roman" w:cs="Times New Roman"/>
+          <w:sz w:val="24"/>
+          <w:szCs w:val="24"/>
+        </w:rPr>
+      </w:pPr>
+      <w:r>
+        <w:rPr>
+          <w:rFonts w:ascii="Times New Roman" w:hAnsi="Times New Roman" w:cs="Times New Roman"/>
+          <w:sz w:val="24"/>
+          <w:szCs w:val="24"/>
+        </w:rPr>
+        <w:t>Menampilkan hasil penambahan kolom:</w:t>
+      </w:r>
+    </w:p>
+    <w:p>
+      <w:pPr>
+        <w:rPr>
+          <w:rFonts w:ascii="Times New Roman" w:hAnsi="Times New Roman" w:cs="Times New Roman"/>
+          <w:sz w:val="24"/>
+          <w:szCs w:val="24"/>
+        </w:rPr>
+      </w:pPr>
+      <w:r>
+        <w:rPr>
+          <w:rFonts w:ascii="Times New Roman" w:hAnsi="Times New Roman" w:cs="Times New Roman"/>
+          <w:sz w:val="24"/>
+          <w:szCs w:val="24"/>
+        </w:rPr>
+        <w:drawing>
+          <wp:inline distT="0" distB="0" distL="0" distR="0">
+            <wp:extent cx="5232669" cy="2622685"/>
+            <wp:effectExtent l="0" t="0" r="6350" b="6350"/>
+            <wp:docPr id="1530314634" name="Picture 7"/>
+            <wp:cNvGraphicFramePr>
+              <a:graphicFrameLocks xmlns:a="http://schemas.openxmlformats.org/drawingml/2006/main" noChangeAspect="1"/>
+            </wp:cNvGraphicFramePr>
+            <a:graphic xmlns:a="http://schemas.openxmlformats.org/drawingml/2006/main">
+              <a:graphicData uri="http://schemas.openxmlformats.org/drawingml/2006/picture">
+                <pic:pic xmlns:pic="http://schemas.openxmlformats.org/drawingml/2006/picture">
+                  <pic:nvPicPr>
+                    <pic:cNvPr id="1530314634" name="Picture 1530314634"/>
+                    <pic:cNvPicPr/>
+                  </pic:nvPicPr>
+                  <pic:blipFill>
+                    <a:blip r:embed="rId36">
+                      <a:extLst>
+                        <a:ext uri="{28A0092B-C50C-407E-A947-70E740481C1C}">
+                          <a14:useLocalDpi xmlns:a14="http://schemas.microsoft.com/office/drawing/2010/main" val="0"/>
+                        </a:ext>
+                      </a:extLst>
+                    </a:blip>
+                    <a:stretch>
+                      <a:fillRect/>
+                    </a:stretch>
+                  </pic:blipFill>
+                  <pic:spPr>
+                    <a:xfrm>
+                      <a:off x="0" y="0"/>
+                      <a:ext cx="5232669" cy="2622685"/>
+                    </a:xfrm>
+                    <a:prstGeom prst="rect">
+                      <a:avLst/>
+                    </a:prstGeom>
+                  </pic:spPr>
+                </pic:pic>
+              </a:graphicData>
+            </a:graphic>
+          </wp:inline>
+        </w:drawing>
+      </w:r>
+    </w:p>
+    <w:p>
+      <w:pPr>
+        <w:rPr>
+          <w:rFonts w:ascii="Times New Roman" w:hAnsi="Times New Roman" w:cs="Times New Roman"/>
+          <w:sz w:val="24"/>
+          <w:szCs w:val="24"/>
+        </w:rPr>
+      </w:pPr>
+    </w:p>
+    <w:p>
+      <w:pPr>
+        <w:rPr>
+          <w:rFonts w:ascii="Times New Roman" w:hAnsi="Times New Roman" w:cs="Times New Roman"/>
+          <w:b/>
+          <w:bCs/>
+          <w:sz w:val="28"/>
+          <w:szCs w:val="28"/>
+        </w:rPr>
+      </w:pPr>
+      <w:r>
+        <w:rPr>
+          <w:rFonts w:ascii="Times New Roman" w:hAnsi="Times New Roman" w:cs="Times New Roman"/>
+          <w:b/>
+          <w:bCs/>
+          <w:sz w:val="28"/>
+          <w:szCs w:val="28"/>
+        </w:rPr>
+        <w:t>Merubah Tipe Data</w:t>
+      </w:r>
+    </w:p>
+    <w:p>
+      <w:pPr>
+        <w:rPr>
+          <w:rFonts w:ascii="Times New Roman" w:hAnsi="Times New Roman" w:cs="Times New Roman"/>
+          <w:sz w:val="24"/>
+          <w:szCs w:val="24"/>
+        </w:rPr>
+      </w:pPr>
+      <w:r>
+        <w:rPr>
+          <w:rFonts w:ascii="Times New Roman" w:hAnsi="Times New Roman" w:cs="Times New Roman"/>
+          <w:sz w:val="24"/>
+          <w:szCs w:val="24"/>
+        </w:rPr>
+        <w:t>Merubah Tipe Data:</w:t>
+      </w:r>
+    </w:p>
+    <w:p>
+      <w:pPr>
+        <w:rPr>
+          <w:rFonts w:ascii="Times New Roman" w:hAnsi="Times New Roman" w:cs="Times New Roman"/>
+          <w:sz w:val="24"/>
+          <w:szCs w:val="24"/>
+        </w:rPr>
+      </w:pPr>
+      <w:r>
+        <w:rPr>
+          <w:rFonts w:ascii="Times New Roman" w:hAnsi="Times New Roman" w:cs="Times New Roman"/>
+          <w:sz w:val="24"/>
+          <w:szCs w:val="24"/>
+        </w:rPr>
+        <w:drawing>
+          <wp:inline distT="0" distB="0" distL="0" distR="0">
+            <wp:extent cx="5239019" cy="1473276"/>
+            <wp:effectExtent l="0" t="0" r="0" b="0"/>
+            <wp:docPr id="27180458" name="Picture 9"/>
+            <wp:cNvGraphicFramePr>
+              <a:graphicFrameLocks xmlns:a="http://schemas.openxmlformats.org/drawingml/2006/main" noChangeAspect="1"/>
+            </wp:cNvGraphicFramePr>
+            <a:graphic xmlns:a="http://schemas.openxmlformats.org/drawingml/2006/main">
+              <a:graphicData uri="http://schemas.openxmlformats.org/drawingml/2006/picture">
+                <pic:pic xmlns:pic="http://schemas.openxmlformats.org/drawingml/2006/picture">
+                  <pic:nvPicPr>
+                    <pic:cNvPr id="27180458" name="Picture 27180458"/>
+                    <pic:cNvPicPr/>
+                  </pic:nvPicPr>
+                  <pic:blipFill>
+                    <a:blip r:embed="rId37">
+                      <a:extLst>
+                        <a:ext uri="{28A0092B-C50C-407E-A947-70E740481C1C}">
+                          <a14:useLocalDpi xmlns:a14="http://schemas.microsoft.com/office/drawing/2010/main" val="0"/>
+                        </a:ext>
+                      </a:extLst>
+                    </a:blip>
+                    <a:stretch>
+                      <a:fillRect/>
+                    </a:stretch>
+                  </pic:blipFill>
+                  <pic:spPr>
+                    <a:xfrm>
+                      <a:off x="0" y="0"/>
+                      <a:ext cx="5239019" cy="1473276"/>
+                    </a:xfrm>
+                    <a:prstGeom prst="rect">
+                      <a:avLst/>
+                    </a:prstGeom>
+                  </pic:spPr>
+                </pic:pic>
+              </a:graphicData>
+            </a:graphic>
+          </wp:inline>
+        </w:drawing>
+      </w:r>
+    </w:p>
+    <w:p>
+      <w:pPr>
+        <w:rPr>
+          <w:rFonts w:ascii="Times New Roman" w:hAnsi="Times New Roman" w:cs="Times New Roman"/>
+          <w:sz w:val="24"/>
+          <w:szCs w:val="24"/>
+        </w:rPr>
+      </w:pPr>
+      <w:r>
+        <w:rPr>
+          <w:rFonts w:ascii="Times New Roman" w:hAnsi="Times New Roman" w:cs="Times New Roman"/>
+          <w:sz w:val="24"/>
+          <w:szCs w:val="24"/>
+        </w:rPr>
+        <w:t>Menampilkan Perubahan Tipe Data:</w:t>
+      </w:r>
+    </w:p>
+    <w:p>
+      <w:pPr>
+        <w:rPr>
+          <w:rFonts w:ascii="Times New Roman" w:hAnsi="Times New Roman" w:cs="Times New Roman"/>
+          <w:sz w:val="24"/>
+          <w:szCs w:val="24"/>
+        </w:rPr>
+      </w:pPr>
+      <w:r>
+        <w:rPr>
+          <w:rFonts w:ascii="Times New Roman" w:hAnsi="Times New Roman" w:cs="Times New Roman"/>
+          <w:sz w:val="24"/>
+          <w:szCs w:val="24"/>
+        </w:rPr>
+        <w:lastRenderedPageBreak/>
+        <w:drawing>
+          <wp:inline distT="0" distB="0" distL="0" distR="0">
+            <wp:extent cx="5232669" cy="2590933"/>
+            <wp:effectExtent l="0" t="0" r="6350" b="0"/>
+            <wp:docPr id="1959804171" name="Picture 8"/>
+            <wp:cNvGraphicFramePr>
+              <a:graphicFrameLocks xmlns:a="http://schemas.openxmlformats.org/drawingml/2006/main" noChangeAspect="1"/>
+            </wp:cNvGraphicFramePr>
+            <a:graphic xmlns:a="http://schemas.openxmlformats.org/drawingml/2006/main">
+              <a:graphicData uri="http://schemas.openxmlformats.org/drawingml/2006/picture">
+                <pic:pic xmlns:pic="http://schemas.openxmlformats.org/drawingml/2006/picture">
+                  <pic:nvPicPr>
+                    <pic:cNvPr id="1959804171" name="Picture 1959804171"/>
+                    <pic:cNvPicPr/>
+                  </pic:nvPicPr>
+                  <pic:blipFill>
+                    <a:blip r:embed="rId38">
+                      <a:extLst>
+                        <a:ext uri="{28A0092B-C50C-407E-A947-70E740481C1C}">
+                          <a14:useLocalDpi xmlns:a14="http://schemas.microsoft.com/office/drawing/2010/main" val="0"/>
+                        </a:ext>
+                      </a:extLst>
+                    </a:blip>
+                    <a:stretch>
+                      <a:fillRect/>
+                    </a:stretch>
+                  </pic:blipFill>
+                  <pic:spPr>
+                    <a:xfrm>
+                      <a:off x="0" y="0"/>
+                      <a:ext cx="5232669" cy="2590933"/>
+                    </a:xfrm>
+                    <a:prstGeom prst="rect">
+                      <a:avLst/>
+                    </a:prstGeom>
+                  </pic:spPr>
+                </pic:pic>
+              </a:graphicData>
+            </a:graphic>
+          </wp:inline>
+        </w:drawing>
+      </w:r>
+    </w:p>
+    <w:p>
+      <w:pPr>
+        <w:rPr>
+          <w:rFonts w:ascii="Times New Roman" w:hAnsi="Times New Roman" w:cs="Times New Roman"/>
+          <w:sz w:val="24"/>
+          <w:szCs w:val="24"/>
+        </w:rPr>
+      </w:pPr>
+    </w:p>
+    <w:p>
+      <w:pPr>
+        <w:rPr>
+          <w:rFonts w:ascii="Times New Roman" w:hAnsi="Times New Roman" w:cs="Times New Roman"/>
+          <w:b/>
+          <w:bCs/>
+          <w:sz w:val="28"/>
+          <w:szCs w:val="28"/>
+        </w:rPr>
+      </w:pPr>
+      <w:r>
+        <w:rPr>
+          <w:rFonts w:ascii="Times New Roman" w:hAnsi="Times New Roman" w:cs="Times New Roman"/>
+          <w:b/>
+          <w:bCs/>
+          <w:sz w:val="28"/>
+          <w:szCs w:val="28"/>
+        </w:rPr>
+        <w:t>Memberi Nilai Default Pada Kolom</w:t>
+      </w:r>
+    </w:p>
+    <w:p>
+      <w:pPr>
+        <w:rPr>
+          <w:rFonts w:ascii="Times New Roman" w:hAnsi="Times New Roman" w:cs="Times New Roman"/>
+          <w:sz w:val="24"/>
+          <w:szCs w:val="24"/>
+        </w:rPr>
+      </w:pPr>
+      <w:r>
+        <w:rPr>
+          <w:rFonts w:ascii="Times New Roman" w:hAnsi="Times New Roman" w:cs="Times New Roman"/>
+          <w:sz w:val="24"/>
+          <w:szCs w:val="24"/>
+        </w:rPr>
+        <w:t>Memberi nilai default pada kolom:</w:t>
+      </w:r>
+    </w:p>
+    <w:p>
+      <w:pPr>
+        <w:rPr>
+          <w:rFonts w:ascii="Times New Roman" w:hAnsi="Times New Roman" w:cs="Times New Roman"/>
+          <w:sz w:val="24"/>
+          <w:szCs w:val="24"/>
+        </w:rPr>
+      </w:pPr>
+      <w:r>
+        <w:rPr>
+          <w:rFonts w:ascii="Times New Roman" w:hAnsi="Times New Roman" w:cs="Times New Roman"/>
+          <w:sz w:val="24"/>
+          <w:szCs w:val="24"/>
+        </w:rPr>
+        <w:drawing>
+          <wp:inline distT="0" distB="0" distL="0" distR="0">
+            <wp:extent cx="5731510" cy="1177925"/>
+            <wp:effectExtent l="0" t="0" r="2540" b="3175"/>
+            <wp:docPr id="1600735489" name="Picture 10"/>
+            <wp:cNvGraphicFramePr>
+              <a:graphicFrameLocks xmlns:a="http://schemas.openxmlformats.org/drawingml/2006/main" noChangeAspect="1"/>
+            </wp:cNvGraphicFramePr>
+            <a:graphic xmlns:a="http://schemas.openxmlformats.org/drawingml/2006/main">
+              <a:graphicData uri="http://schemas.openxmlformats.org/drawingml/2006/picture">
+                <pic:pic xmlns:pic="http://schemas.openxmlformats.org/drawingml/2006/picture">
+                  <pic:nvPicPr>
+                    <pic:cNvPr id="1600735489" name="Picture 1600735489"/>
+                    <pic:cNvPicPr/>
+                  </pic:nvPicPr>
+                  <pic:blipFill>
+                    <a:blip r:embed="rId39">
+                      <a:extLst>
+                        <a:ext uri="{28A0092B-C50C-407E-A947-70E740481C1C}">
+                          <a14:useLocalDpi xmlns:a14="http://schemas.microsoft.com/office/drawing/2010/main" val="0"/>
+                        </a:ext>
+                      </a:extLst>
+                    </a:blip>
+                    <a:stretch>
+                      <a:fillRect/>
+                    </a:stretch>
+                  </pic:blipFill>
+                  <pic:spPr>
+                    <a:xfrm>
+                      <a:off x="0" y="0"/>
+                      <a:ext cx="5731510" cy="1177925"/>
+                    </a:xfrm>
+                    <a:prstGeom prst="rect">
+                      <a:avLst/>
+                    </a:prstGeom>
+                  </pic:spPr>
+                </pic:pic>
+              </a:graphicData>
+            </a:graphic>
+          </wp:inline>
+        </w:drawing>
+      </w:r>
+    </w:p>
+    <w:p>
+      <w:pPr>
+        <w:rPr>
+          <w:rFonts w:ascii="Times New Roman" w:hAnsi="Times New Roman" w:cs="Times New Roman"/>
+          <w:sz w:val="24"/>
+          <w:szCs w:val="24"/>
+        </w:rPr>
+      </w:pPr>
+      <w:r>
+        <w:rPr>
+          <w:rFonts w:ascii="Times New Roman" w:hAnsi="Times New Roman" w:cs="Times New Roman"/>
+          <w:sz w:val="24"/>
+          <w:szCs w:val="24"/>
+        </w:rPr>
+        <w:t>Hasil pemberian nilai default pada kolom:</w:t>
+      </w:r>
+    </w:p>
+    <w:p>
+      <w:pPr>
+        <w:rPr>
+          <w:rFonts w:ascii="Times New Roman" w:hAnsi="Times New Roman" w:cs="Times New Roman"/>
+          <w:sz w:val="24"/>
+          <w:szCs w:val="24"/>
+        </w:rPr>
+      </w:pPr>
+      <w:r>
+        <w:rPr>
+          <w:rFonts w:ascii="Times New Roman" w:hAnsi="Times New Roman" w:cs="Times New Roman"/>
+          <w:sz w:val="24"/>
+          <w:szCs w:val="24"/>
+        </w:rPr>
+        <w:drawing>
+          <wp:inline distT="0" distB="0" distL="0" distR="0">
+            <wp:extent cx="5727994" cy="2444876"/>
+            <wp:effectExtent l="0" t="0" r="6350" b="0"/>
+            <wp:docPr id="237388663" name="Picture 11"/>
+            <wp:cNvGraphicFramePr>
+              <a:graphicFrameLocks xmlns:a="http://schemas.openxmlformats.org/drawingml/2006/main" noChangeAspect="1"/>
+            </wp:cNvGraphicFramePr>
+            <a:graphic xmlns:a="http://schemas.openxmlformats.org/drawingml/2006/main">
+              <a:graphicData uri="http://schemas.openxmlformats.org/drawingml/2006/picture">
+                <pic:pic xmlns:pic="http://schemas.openxmlformats.org/drawingml/2006/picture">
+                  <pic:nvPicPr>
+                    <pic:cNvPr id="237388663" name="Picture 237388663"/>
+                    <pic:cNvPicPr/>
+                  </pic:nvPicPr>
+                  <pic:blipFill>
+                    <a:blip r:embed="rId40">
+                      <a:extLst>
+                        <a:ext uri="{28A0092B-C50C-407E-A947-70E740481C1C}">
+                          <a14:useLocalDpi xmlns:a14="http://schemas.microsoft.com/office/drawing/2010/main" val="0"/>
+                        </a:ext>
+                      </a:extLst>
+                    </a:blip>
+                    <a:stretch>
+                      <a:fillRect/>
+                    </a:stretch>
+                  </pic:blipFill>
+                  <pic:spPr>
+                    <a:xfrm>
+                      <a:off x="0" y="0"/>
+                      <a:ext cx="5727994" cy="2444876"/>
+                    </a:xfrm>
+                    <a:prstGeom prst="rect">
+                      <a:avLst/>
+                    </a:prstGeom>
+                  </pic:spPr>
+                </pic:pic>
+              </a:graphicData>
+            </a:graphic>
+          </wp:inline>
+        </w:drawing>
+      </w:r>
+    </w:p>
+    <w:p>
+      <w:pPr>
+        <w:rPr>
+          <w:rFonts w:ascii="Times New Roman" w:hAnsi="Times New Roman" w:cs="Times New Roman"/>
+          <w:sz w:val="24"/>
+          <w:szCs w:val="24"/>
+        </w:rPr>
+      </w:pPr>
+    </w:p>
+    <w:p>
+      <w:pPr>
+        <w:rPr>
+          <w:rFonts w:ascii="Times New Roman" w:hAnsi="Times New Roman" w:cs="Times New Roman"/>
+          <w:b/>
+          <w:bCs/>
+          <w:sz w:val="28"/>
+          <w:szCs w:val="28"/>
+        </w:rPr>
+      </w:pPr>
+      <w:r>
+        <w:rPr>
+          <w:rFonts w:ascii="Times New Roman" w:hAnsi="Times New Roman" w:cs="Times New Roman"/>
+          <w:b/>
+          <w:bCs/>
+          <w:sz w:val="28"/>
+          <w:szCs w:val="28"/>
+        </w:rPr>
+        <w:t>Menghapus Kolom</w:t>
+      </w:r>
+    </w:p>
+    <w:p>
+      <w:pPr>
+        <w:rPr>
+          <w:rFonts w:ascii="Times New Roman" w:hAnsi="Times New Roman" w:cs="Times New Roman"/>
+          <w:sz w:val="24"/>
+          <w:szCs w:val="24"/>
+        </w:rPr>
+      </w:pPr>
+      <w:r>
+        <w:rPr>
+          <w:rFonts w:ascii="Times New Roman" w:hAnsi="Times New Roman" w:cs="Times New Roman"/>
+          <w:sz w:val="24"/>
+          <w:szCs w:val="24"/>
+        </w:rPr>
+        <w:t>Menambahkan kolom baru yang bernama stokminimal pada tabel tblbarang</w:t>
+      </w:r>
+      <w:r>
+        <w:rPr>
+          <w:rFonts w:ascii="Times New Roman" w:hAnsi="Times New Roman" w:cs="Times New Roman"/>
+          <w:sz w:val="24"/>
+          <w:szCs w:val="24"/>
+        </w:rPr>
+        <w:t>:</w:t>
+      </w:r>
+    </w:p>
+    <w:p>
+      <w:pPr>
+        <w:rPr>
+          <w:rFonts w:ascii="Times New Roman" w:hAnsi="Times New Roman" w:cs="Times New Roman"/>
+          <w:sz w:val="24"/>
+          <w:szCs w:val="24"/>
+        </w:rPr>
+      </w:pPr>
+      <w:r>
+        <w:rPr>
+          <w:rFonts w:ascii="Times New Roman" w:hAnsi="Times New Roman" w:cs="Times New Roman"/>
+          <w:sz w:val="24"/>
+          <w:szCs w:val="24"/>
+        </w:rPr>
+        <w:lastRenderedPageBreak/>
+        <w:drawing>
+          <wp:inline distT="0" distB="0" distL="0" distR="0">
+            <wp:extent cx="4985006" cy="1397072"/>
+            <wp:effectExtent l="0" t="0" r="6350" b="0"/>
+            <wp:docPr id="1581642529" name="Picture 12"/>
+            <wp:cNvGraphicFramePr>
+              <a:graphicFrameLocks xmlns:a="http://schemas.openxmlformats.org/drawingml/2006/main" noChangeAspect="1"/>
+            </wp:cNvGraphicFramePr>
+            <a:graphic xmlns:a="http://schemas.openxmlformats.org/drawingml/2006/main">
+              <a:graphicData uri="http://schemas.openxmlformats.org/drawingml/2006/picture">
+                <pic:pic xmlns:pic="http://schemas.openxmlformats.org/drawingml/2006/picture">
+                  <pic:nvPicPr>
+                    <pic:cNvPr id="1581642529" name="Picture 1581642529"/>
+                    <pic:cNvPicPr/>
+                  </pic:nvPicPr>
+                  <pic:blipFill>
+                    <a:blip r:embed="rId41">
+                      <a:extLst>
+                        <a:ext uri="{28A0092B-C50C-407E-A947-70E740481C1C}">
+                          <a14:useLocalDpi xmlns:a14="http://schemas.microsoft.com/office/drawing/2010/main" val="0"/>
+                        </a:ext>
+                      </a:extLst>
+                    </a:blip>
+                    <a:stretch>
+                      <a:fillRect/>
+                    </a:stretch>
+                  </pic:blipFill>
+                  <pic:spPr>
+                    <a:xfrm>
+                      <a:off x="0" y="0"/>
+                      <a:ext cx="4985006" cy="1397072"/>
+                    </a:xfrm>
+                    <a:prstGeom prst="rect">
+                      <a:avLst/>
+                    </a:prstGeom>
+                  </pic:spPr>
+                </pic:pic>
+              </a:graphicData>
+            </a:graphic>
+          </wp:inline>
+        </w:drawing>
+      </w:r>
+    </w:p>
+    <w:p>
+      <w:pPr>
+        <w:rPr>
+          <w:rFonts w:ascii="Times New Roman" w:hAnsi="Times New Roman" w:cs="Times New Roman"/>
+          <w:sz w:val="24"/>
+          <w:szCs w:val="24"/>
+        </w:rPr>
+      </w:pPr>
+      <w:r>
+        <w:rPr>
+          <w:rFonts w:ascii="Times New Roman" w:hAnsi="Times New Roman" w:cs="Times New Roman"/>
+          <w:sz w:val="24"/>
+          <w:szCs w:val="24"/>
+        </w:rPr>
+        <w:t>Menampilkan hasil penambahan kolom baru</w:t>
+      </w:r>
+      <w:r>
+        <w:rPr>
+          <w:rFonts w:ascii="Times New Roman" w:hAnsi="Times New Roman" w:cs="Times New Roman"/>
+          <w:sz w:val="24"/>
+          <w:szCs w:val="24"/>
+        </w:rPr>
+        <w:t>:</w:t>
+      </w:r>
+    </w:p>
+    <w:p>
+      <w:pPr>
+        <w:rPr>
+          <w:rFonts w:ascii="Times New Roman" w:hAnsi="Times New Roman" w:cs="Times New Roman"/>
+          <w:sz w:val="24"/>
+          <w:szCs w:val="24"/>
+        </w:rPr>
+      </w:pPr>
+      <w:r>
+        <w:rPr>
+          <w:rFonts w:ascii="Times New Roman" w:hAnsi="Times New Roman" w:cs="Times New Roman"/>
+          <w:sz w:val="24"/>
+          <w:szCs w:val="24"/>
+        </w:rPr>
+        <w:drawing>
+          <wp:inline distT="0" distB="0" distL="0" distR="0">
+            <wp:extent cx="5315223" cy="2654436"/>
+            <wp:effectExtent l="0" t="0" r="0" b="0"/>
+            <wp:docPr id="1210782043" name="Picture 13"/>
+            <wp:cNvGraphicFramePr>
+              <a:graphicFrameLocks xmlns:a="http://schemas.openxmlformats.org/drawingml/2006/main" noChangeAspect="1"/>
+            </wp:cNvGraphicFramePr>
+            <a:graphic xmlns:a="http://schemas.openxmlformats.org/drawingml/2006/main">
+              <a:graphicData uri="http://schemas.openxmlformats.org/drawingml/2006/picture">
+                <pic:pic xmlns:pic="http://schemas.openxmlformats.org/drawingml/2006/picture">
+                  <pic:nvPicPr>
+                    <pic:cNvPr id="1210782043" name="Picture 1210782043"/>
+                    <pic:cNvPicPr/>
+                  </pic:nvPicPr>
+                  <pic:blipFill>
+                    <a:blip r:embed="rId42">
+                      <a:extLst>
+                        <a:ext uri="{28A0092B-C50C-407E-A947-70E740481C1C}">
+                          <a14:useLocalDpi xmlns:a14="http://schemas.microsoft.com/office/drawing/2010/main" val="0"/>
+                        </a:ext>
+                      </a:extLst>
+                    </a:blip>
+                    <a:stretch>
+                      <a:fillRect/>
+                    </a:stretch>
+                  </pic:blipFill>
+                  <pic:spPr>
+                    <a:xfrm>
+                      <a:off x="0" y="0"/>
+                      <a:ext cx="5315223" cy="2654436"/>
+                    </a:xfrm>
+                    <a:prstGeom prst="rect">
+                      <a:avLst/>
+                    </a:prstGeom>
+                  </pic:spPr>
+                </pic:pic>
+              </a:graphicData>
+            </a:graphic>
+          </wp:inline>
+        </w:drawing>
+      </w:r>
+    </w:p>
+    <w:p>
+      <w:pPr>
+        <w:rPr>
+          <w:rFonts w:ascii="Times New Roman" w:hAnsi="Times New Roman" w:cs="Times New Roman"/>
+          <w:sz w:val="24"/>
+          <w:szCs w:val="24"/>
+        </w:rPr>
+      </w:pPr>
+      <w:r>
+        <w:rPr>
+          <w:rFonts w:ascii="Times New Roman" w:hAnsi="Times New Roman" w:cs="Times New Roman"/>
+          <w:sz w:val="24"/>
+          <w:szCs w:val="24"/>
+        </w:rPr>
+        <w:t>Menghapus kolom yang baru dibuat (bernama stokminimal):</w:t>
+      </w:r>
+    </w:p>
+    <w:p>
+      <w:pPr>
+        <w:rPr>
+          <w:rFonts w:ascii="Times New Roman" w:hAnsi="Times New Roman" w:cs="Times New Roman"/>
+          <w:sz w:val="24"/>
+          <w:szCs w:val="24"/>
+        </w:rPr>
+      </w:pPr>
+      <w:r>
+        <w:rPr>
+          <w:rFonts w:ascii="Times New Roman" w:hAnsi="Times New Roman" w:cs="Times New Roman"/>
+          <w:sz w:val="24"/>
+          <w:szCs w:val="24"/>
+        </w:rPr>
+        <w:drawing>
+          <wp:inline distT="0" distB="0" distL="0" distR="0">
+            <wp:extent cx="5340624" cy="1644735"/>
+            <wp:effectExtent l="0" t="0" r="0" b="0"/>
+            <wp:docPr id="706941379" name="Picture 14"/>
+            <wp:cNvGraphicFramePr>
+              <a:graphicFrameLocks xmlns:a="http://schemas.openxmlformats.org/drawingml/2006/main" noChangeAspect="1"/>
+            </wp:cNvGraphicFramePr>
+            <a:graphic xmlns:a="http://schemas.openxmlformats.org/drawingml/2006/main">
+              <a:graphicData uri="http://schemas.openxmlformats.org/drawingml/2006/picture">
+                <pic:pic xmlns:pic="http://schemas.openxmlformats.org/drawingml/2006/picture">
+                  <pic:nvPicPr>
+                    <pic:cNvPr id="706941379" name="Picture 706941379"/>
+                    <pic:cNvPicPr/>
+                  </pic:nvPicPr>
+                  <pic:blipFill>
+                    <a:blip r:embed="rId43">
+                      <a:extLst>
+                        <a:ext uri="{28A0092B-C50C-407E-A947-70E740481C1C}">
+                          <a14:useLocalDpi xmlns:a14="http://schemas.microsoft.com/office/drawing/2010/main" val="0"/>
+                        </a:ext>
+                      </a:extLst>
+                    </a:blip>
+                    <a:stretch>
+                      <a:fillRect/>
+                    </a:stretch>
+                  </pic:blipFill>
+                  <pic:spPr>
+                    <a:xfrm>
+                      <a:off x="0" y="0"/>
+                      <a:ext cx="5340624" cy="1644735"/>
+                    </a:xfrm>
+                    <a:prstGeom prst="rect">
+                      <a:avLst/>
+                    </a:prstGeom>
+                  </pic:spPr>
+                </pic:pic>
+              </a:graphicData>
+            </a:graphic>
+          </wp:inline>
+        </w:drawing>
+      </w:r>
+    </w:p>
+    <w:p>
+      <w:pPr>
+        <w:rPr>
+          <w:rFonts w:ascii="Times New Roman" w:hAnsi="Times New Roman" w:cs="Times New Roman"/>
+          <w:sz w:val="24"/>
+          <w:szCs w:val="24"/>
+        </w:rPr>
+      </w:pPr>
+      <w:r>
+        <w:rPr>
+          <w:rFonts w:ascii="Times New Roman" w:hAnsi="Times New Roman" w:cs="Times New Roman"/>
+          <w:sz w:val="24"/>
+          <w:szCs w:val="24"/>
+        </w:rPr>
+        <w:t>Hasil penghapusan kolom:</w:t>
+      </w:r>
+    </w:p>
+    <w:p>
+      <w:pPr>
+        <w:rPr>
+          <w:rFonts w:ascii="Times New Roman" w:hAnsi="Times New Roman" w:cs="Times New Roman"/>
+          <w:sz w:val="24"/>
+          <w:szCs w:val="24"/>
+        </w:rPr>
+      </w:pPr>
+      <w:r>
+        <w:rPr>
+          <w:rFonts w:ascii="Times New Roman" w:hAnsi="Times New Roman" w:cs="Times New Roman"/>
+          <w:sz w:val="24"/>
+          <w:szCs w:val="24"/>
+        </w:rPr>
+        <w:lastRenderedPageBreak/>
+        <w:drawing>
+          <wp:inline distT="0" distB="0" distL="0" distR="0">
+            <wp:extent cx="5308873" cy="2648086"/>
+            <wp:effectExtent l="0" t="0" r="6350" b="0"/>
+            <wp:docPr id="938267131" name="Picture 15"/>
+            <wp:cNvGraphicFramePr>
+              <a:graphicFrameLocks xmlns:a="http://schemas.openxmlformats.org/drawingml/2006/main" noChangeAspect="1"/>
+            </wp:cNvGraphicFramePr>
+            <a:graphic xmlns:a="http://schemas.openxmlformats.org/drawingml/2006/main">
+              <a:graphicData uri="http://schemas.openxmlformats.org/drawingml/2006/picture">
+                <pic:pic xmlns:pic="http://schemas.openxmlformats.org/drawingml/2006/picture">
+                  <pic:nvPicPr>
+                    <pic:cNvPr id="938267131" name="Picture 938267131"/>
+                    <pic:cNvPicPr/>
+                  </pic:nvPicPr>
+                  <pic:blipFill>
+                    <a:blip r:embed="rId44">
+                      <a:extLst>
+                        <a:ext uri="{28A0092B-C50C-407E-A947-70E740481C1C}">
+                          <a14:useLocalDpi xmlns:a14="http://schemas.microsoft.com/office/drawing/2010/main" val="0"/>
+                        </a:ext>
+                      </a:extLst>
+                    </a:blip>
+                    <a:stretch>
+                      <a:fillRect/>
+                    </a:stretch>
+                  </pic:blipFill>
+                  <pic:spPr>
+                    <a:xfrm>
+                      <a:off x="0" y="0"/>
+                      <a:ext cx="5308873" cy="2648086"/>
+                    </a:xfrm>
+                    <a:prstGeom prst="rect">
+                      <a:avLst/>
+                    </a:prstGeom>
+                  </pic:spPr>
+                </pic:pic>
+              </a:graphicData>
+            </a:graphic>
+          </wp:inline>
+        </w:drawing>
+      </w:r>
+    </w:p>
+    <w:p>
+      <w:pPr>
+        <w:rPr>
+          <w:rFonts w:ascii="Times New Roman" w:hAnsi="Times New Roman" w:cs="Times New Roman"/>
+          <w:sz w:val="24"/>
+          <w:szCs w:val="24"/>
+        </w:rPr>
+      </w:pPr>
+    </w:p>
+    <w:p>
+      <w:pPr>
+        <w:rPr>
+          <w:rFonts w:ascii="Times New Roman" w:hAnsi="Times New Roman" w:cs="Times New Roman"/>
+          <w:b/>
+          <w:bCs/>
+          <w:sz w:val="28"/>
+          <w:szCs w:val="28"/>
+        </w:rPr>
+      </w:pPr>
+      <w:r>
+        <w:rPr>
+          <w:rFonts w:ascii="Times New Roman" w:hAnsi="Times New Roman" w:cs="Times New Roman"/>
+          <w:b/>
+          <w:bCs/>
+          <w:sz w:val="28"/>
+          <w:szCs w:val="28"/>
+        </w:rPr>
+        <w:t>Merubah Nama Kolom</w:t>
+      </w:r>
+    </w:p>
+    <w:p>
+      <w:pPr>
+        <w:rPr>
+          <w:rFonts w:ascii="Times New Roman" w:hAnsi="Times New Roman" w:cs="Times New Roman"/>
+          <w:sz w:val="24"/>
+          <w:szCs w:val="24"/>
+        </w:rPr>
+      </w:pPr>
+      <w:r>
+        <w:rPr>
+          <w:rFonts w:ascii="Times New Roman" w:hAnsi="Times New Roman" w:cs="Times New Roman"/>
+          <w:sz w:val="24"/>
+          <w:szCs w:val="24"/>
+        </w:rPr>
+        <w:t>Merubah nama kolom:</w:t>
+      </w:r>
+    </w:p>
+    <w:p>
+      <w:pPr>
+        <w:rPr>
+          <w:rFonts w:ascii="Times New Roman" w:hAnsi="Times New Roman" w:cs="Times New Roman"/>
+          <w:sz w:val="24"/>
+          <w:szCs w:val="24"/>
+        </w:rPr>
+      </w:pPr>
+      <w:r>
+        <w:rPr>
+          <w:rFonts w:ascii="Times New Roman" w:hAnsi="Times New Roman" w:cs="Times New Roman"/>
+          <w:sz w:val="24"/>
+          <w:szCs w:val="24"/>
+        </w:rPr>
+        <w:drawing>
+          <wp:inline distT="0" distB="0" distL="0" distR="0">
+            <wp:extent cx="5334274" cy="1200212"/>
+            <wp:effectExtent l="0" t="0" r="0" b="0"/>
+            <wp:docPr id="877265710" name="Picture 17"/>
+            <wp:cNvGraphicFramePr>
+              <a:graphicFrameLocks xmlns:a="http://schemas.openxmlformats.org/drawingml/2006/main" noChangeAspect="1"/>
+            </wp:cNvGraphicFramePr>
+            <a:graphic xmlns:a="http://schemas.openxmlformats.org/drawingml/2006/main">
+              <a:graphicData uri="http://schemas.openxmlformats.org/drawingml/2006/picture">
+                <pic:pic xmlns:pic="http://schemas.openxmlformats.org/drawingml/2006/picture">
+                  <pic:nvPicPr>
+                    <pic:cNvPr id="877265710" name="Picture 877265710"/>
+                    <pic:cNvPicPr/>
+                  </pic:nvPicPr>
+                  <pic:blipFill>
+                    <a:blip r:embed="rId45">
+                      <a:extLst>
+                        <a:ext uri="{28A0092B-C50C-407E-A947-70E740481C1C}">
+                          <a14:useLocalDpi xmlns:a14="http://schemas.microsoft.com/office/drawing/2010/main" val="0"/>
+                        </a:ext>
+                      </a:extLst>
+                    </a:blip>
+                    <a:stretch>
+                      <a:fillRect/>
+                    </a:stretch>
+                  </pic:blipFill>
+                  <pic:spPr>
+                    <a:xfrm>
+                      <a:off x="0" y="0"/>
+                      <a:ext cx="5334274" cy="1200212"/>
+                    </a:xfrm>
+                    <a:prstGeom prst="rect">
+                      <a:avLst/>
+                    </a:prstGeom>
+                  </pic:spPr>
+                </pic:pic>
+              </a:graphicData>
+            </a:graphic>
+          </wp:inline>
+        </w:drawing>
+      </w:r>
+    </w:p>
+    <w:p>
+      <w:pPr>
+        <w:rPr>
+          <w:rFonts w:ascii="Times New Roman" w:hAnsi="Times New Roman" w:cs="Times New Roman"/>
+          <w:sz w:val="24"/>
+          <w:szCs w:val="24"/>
+        </w:rPr>
+      </w:pPr>
+      <w:r>
+        <w:rPr>
+          <w:rFonts w:ascii="Times New Roman" w:hAnsi="Times New Roman" w:cs="Times New Roman"/>
+          <w:sz w:val="24"/>
+          <w:szCs w:val="24"/>
+        </w:rPr>
+        <w:t>Memeriksa struktur tabel:</w:t>
+      </w:r>
+    </w:p>
+    <w:p>
+      <w:pPr>
+        <w:rPr>
+          <w:rFonts w:ascii="Times New Roman" w:hAnsi="Times New Roman" w:cs="Times New Roman"/>
+          <w:sz w:val="24"/>
+          <w:szCs w:val="24"/>
+        </w:rPr>
+      </w:pPr>
+      <w:r>
+        <w:rPr>
+          <w:rFonts w:ascii="Times New Roman" w:hAnsi="Times New Roman" w:cs="Times New Roman"/>
+          <w:sz w:val="24"/>
+          <w:szCs w:val="24"/>
+        </w:rPr>
+        <w:drawing>
+          <wp:inline distT="0" distB="0" distL="0" distR="0">
+            <wp:extent cx="5308873" cy="2692538"/>
+            <wp:effectExtent l="0" t="0" r="6350" b="0"/>
+            <wp:docPr id="1814045178" name="Picture 16"/>
+            <wp:cNvGraphicFramePr>
+              <a:graphicFrameLocks xmlns:a="http://schemas.openxmlformats.org/drawingml/2006/main" noChangeAspect="1"/>
+            </wp:cNvGraphicFramePr>
+            <a:graphic xmlns:a="http://schemas.openxmlformats.org/drawingml/2006/main">
+              <a:graphicData uri="http://schemas.openxmlformats.org/drawingml/2006/picture">
+                <pic:pic xmlns:pic="http://schemas.openxmlformats.org/drawingml/2006/picture">
+                  <pic:nvPicPr>
+                    <pic:cNvPr id="1814045178" name="Picture 1814045178"/>
+                    <pic:cNvPicPr/>
+                  </pic:nvPicPr>
+                  <pic:blipFill>
+                    <a:blip r:embed="rId46">
+                      <a:extLst>
+                        <a:ext uri="{28A0092B-C50C-407E-A947-70E740481C1C}">
+                          <a14:useLocalDpi xmlns:a14="http://schemas.microsoft.com/office/drawing/2010/main" val="0"/>
+                        </a:ext>
+                      </a:extLst>
+                    </a:blip>
+                    <a:stretch>
+                      <a:fillRect/>
+                    </a:stretch>
+                  </pic:blipFill>
+                  <pic:spPr>
+                    <a:xfrm>
+                      <a:off x="0" y="0"/>
+                      <a:ext cx="5308873" cy="2692538"/>
+                    </a:xfrm>
+                    <a:prstGeom prst="rect">
+                      <a:avLst/>
+                    </a:prstGeom>
+                  </pic:spPr>
+                </pic:pic>
+              </a:graphicData>
+            </a:graphic>
+          </wp:inline>
+        </w:drawing>
+      </w:r>
+    </w:p>
+    <w:p>
+      <w:pPr>
+        <w:rPr>
+          <w:rFonts w:ascii="Times New Roman" w:hAnsi="Times New Roman" w:cs="Times New Roman"/>
+          <w:b/>
+          <w:bCs/>
+          <w:sz w:val="24"/>
+          <w:szCs w:val="24"/>
+          <w:u w:val="single"/>
+        </w:rPr>
+      </w:pPr>
+      <w:r>
+        <w:rPr>
+          <w:rFonts w:ascii="Times New Roman" w:hAnsi="Times New Roman" w:cs="Times New Roman"/>
+          <w:b/>
+          <w:bCs/>
+          <w:sz w:val="24"/>
+          <w:szCs w:val="24"/>
+          <w:u w:val="single"/>
+        </w:rPr>
+        <w:t>Membuat Tabel tblpelanggan:</w:t>
+      </w:r>
+    </w:p>
+    <w:p>
+      <w:pPr>
+        <w:rPr>
+          <w:rFonts w:ascii="Times New Roman" w:hAnsi="Times New Roman" w:cs="Times New Roman"/>
+          <w:b/>
+          <w:bCs/>
+          <w:sz w:val="24"/>
+          <w:szCs w:val="24"/>
+          <w:u w:val="single"/>
+        </w:rPr>
+      </w:pPr>
+      <w:r>
+        <w:rPr>
+          <w:rFonts w:ascii="Times New Roman" w:hAnsi="Times New Roman" w:cs="Times New Roman"/>
+          <w:b/>
+          <w:bCs/>
+          <w:sz w:val="24"/>
+          <w:szCs w:val="24"/>
+          <w:u w:val="single"/>
+        </w:rPr>
+        <w:lastRenderedPageBreak/>
+        <w:drawing>
+          <wp:inline distT="0" distB="0" distL="0" distR="0">
+            <wp:extent cx="5315223" cy="1911448"/>
+            <wp:effectExtent l="0" t="0" r="0" b="0"/>
+            <wp:docPr id="1580345914" name="Picture 18"/>
+            <wp:cNvGraphicFramePr>
+              <a:graphicFrameLocks xmlns:a="http://schemas.openxmlformats.org/drawingml/2006/main" noChangeAspect="1"/>
+            </wp:cNvGraphicFramePr>
+            <a:graphic xmlns:a="http://schemas.openxmlformats.org/drawingml/2006/main">
+              <a:graphicData uri="http://schemas.openxmlformats.org/drawingml/2006/picture">
+                <pic:pic xmlns:pic="http://schemas.openxmlformats.org/drawingml/2006/picture">
+                  <pic:nvPicPr>
+                    <pic:cNvPr id="1580345914" name="Picture 1580345914"/>
+                    <pic:cNvPicPr/>
+                  </pic:nvPicPr>
+                  <pic:blipFill>
+                    <a:blip r:embed="rId47">
+                      <a:extLst>
+                        <a:ext uri="{28A0092B-C50C-407E-A947-70E740481C1C}">
+                          <a14:useLocalDpi xmlns:a14="http://schemas.microsoft.com/office/drawing/2010/main" val="0"/>
+                        </a:ext>
+                      </a:extLst>
+                    </a:blip>
+                    <a:stretch>
+                      <a:fillRect/>
+                    </a:stretch>
+                  </pic:blipFill>
+                  <pic:spPr>
+                    <a:xfrm>
+                      <a:off x="0" y="0"/>
+                      <a:ext cx="5315223" cy="1911448"/>
+                    </a:xfrm>
+                    <a:prstGeom prst="rect">
+                      <a:avLst/>
+                    </a:prstGeom>
+                  </pic:spPr>
+                </pic:pic>
+              </a:graphicData>
+            </a:graphic>
+          </wp:inline>
+        </w:drawing>
+      </w:r>
+    </w:p>
+    <w:p>
+      <w:pPr>
+        <w:rPr>
+          <w:rFonts w:ascii="Times New Roman" w:hAnsi="Times New Roman" w:cs="Times New Roman"/>
+          <w:b/>
+          <w:bCs/>
+          <w:sz w:val="24"/>
+          <w:szCs w:val="24"/>
+          <w:u w:val="single"/>
+        </w:rPr>
+      </w:pPr>
+    </w:p>
+    <w:p>
+      <w:pPr>
+        <w:rPr>
+          <w:rFonts w:ascii="Times New Roman" w:hAnsi="Times New Roman" w:cs="Times New Roman"/>
+          <w:b/>
+          <w:bCs/>
+          <w:sz w:val="28"/>
+          <w:szCs w:val="28"/>
+        </w:rPr>
+      </w:pPr>
+      <w:r>
+        <w:rPr>
+          <w:rFonts w:ascii="Times New Roman" w:hAnsi="Times New Roman" w:cs="Times New Roman"/>
+          <w:b/>
+          <w:bCs/>
+          <w:sz w:val="28"/>
+          <w:szCs w:val="28"/>
+        </w:rPr>
+        <w:t>Menambahkan Primary Key</w:t>
+      </w:r>
+    </w:p>
+    <w:p>
+      <w:pPr>
+        <w:rPr>
+          <w:rFonts w:ascii="Times New Roman" w:hAnsi="Times New Roman" w:cs="Times New Roman"/>
+          <w:sz w:val="24"/>
+          <w:szCs w:val="24"/>
+        </w:rPr>
+      </w:pPr>
+      <w:r>
+        <w:rPr>
+          <w:rFonts w:ascii="Times New Roman" w:hAnsi="Times New Roman" w:cs="Times New Roman"/>
+          <w:sz w:val="24"/>
+          <w:szCs w:val="24"/>
+        </w:rPr>
+        <w:t>Primary key pada database ialah</w:t>
+      </w:r>
+      <w:r>
+        <w:rPr>
+          <w:rFonts w:ascii="Times New Roman" w:hAnsi="Times New Roman" w:cs="Times New Roman"/>
+          <w:sz w:val="24"/>
+          <w:szCs w:val="24"/>
+        </w:rPr>
+        <w:t xml:space="preserve"> sebuah kolom yang akan memastikan bahwa setiap data pada kolom tersebut terisi dengan value yang berbeda, tidak boleh ada yang sama dengan value pada data lainnya.</w:t>
+      </w:r>
+    </w:p>
+    <w:p>
+      <w:pPr>
+        <w:rPr>
+          <w:rFonts w:ascii="Times New Roman" w:hAnsi="Times New Roman" w:cs="Times New Roman"/>
+          <w:sz w:val="24"/>
+          <w:szCs w:val="24"/>
+        </w:rPr>
+      </w:pPr>
+      <w:r>
+        <w:rPr>
+          <w:rFonts w:ascii="Times New Roman" w:hAnsi="Times New Roman" w:cs="Times New Roman"/>
+          <w:sz w:val="24"/>
+          <w:szCs w:val="24"/>
+        </w:rPr>
+        <w:drawing>
+          <wp:inline distT="0" distB="0" distL="0" distR="0">
+            <wp:extent cx="5334274" cy="1435174"/>
+            <wp:effectExtent l="0" t="0" r="0" b="0"/>
+            <wp:docPr id="1946947588" name="Picture 19"/>
+            <wp:cNvGraphicFramePr>
+              <a:graphicFrameLocks xmlns:a="http://schemas.openxmlformats.org/drawingml/2006/main" noChangeAspect="1"/>
+            </wp:cNvGraphicFramePr>
+            <a:graphic xmlns:a="http://schemas.openxmlformats.org/drawingml/2006/main">
+              <a:graphicData uri="http://schemas.openxmlformats.org/drawingml/2006/picture">
+                <pic:pic xmlns:pic="http://schemas.openxmlformats.org/drawingml/2006/picture">
+                  <pic:nvPicPr>
+                    <pic:cNvPr id="1946947588" name="Picture 1946947588"/>
+                    <pic:cNvPicPr/>
+                  </pic:nvPicPr>
+                  <pic:blipFill>
+                    <a:blip r:embed="rId48">
+                      <a:extLst>
+                        <a:ext uri="{28A0092B-C50C-407E-A947-70E740481C1C}">
+                          <a14:useLocalDpi xmlns:a14="http://schemas.microsoft.com/office/drawing/2010/main" val="0"/>
+                        </a:ext>
+                      </a:extLst>
+                    </a:blip>
+                    <a:stretch>
+                      <a:fillRect/>
+                    </a:stretch>
+                  </pic:blipFill>
+                  <pic:spPr>
+                    <a:xfrm>
+                      <a:off x="0" y="0"/>
+                      <a:ext cx="5334274" cy="1435174"/>
+                    </a:xfrm>
+                    <a:prstGeom prst="rect">
+                      <a:avLst/>
+                    </a:prstGeom>
+                  </pic:spPr>
+                </pic:pic>
+              </a:graphicData>
+            </a:graphic>
+          </wp:inline>
+        </w:drawing>
+      </w:r>
+    </w:p>
+    <w:p>
+      <w:pPr>
+        <w:rPr>
+          <w:rFonts w:ascii="Times New Roman" w:hAnsi="Times New Roman" w:cs="Times New Roman"/>
+          <w:b/>
+          <w:bCs/>
+          <w:sz w:val="28"/>
+          <w:szCs w:val="28"/>
+        </w:rPr>
+      </w:pPr>
+    </w:p>
+    <w:p>
+      <w:pPr>
+        <w:rPr>
+          <w:rFonts w:ascii="Times New Roman" w:hAnsi="Times New Roman" w:cs="Times New Roman"/>
+          <w:b/>
+          <w:bCs/>
+          <w:sz w:val="28"/>
+          <w:szCs w:val="28"/>
+        </w:rPr>
+      </w:pPr>
+      <w:r>
+        <w:rPr>
+          <w:rFonts w:ascii="Times New Roman" w:hAnsi="Times New Roman" w:cs="Times New Roman"/>
+          <w:b/>
+          <w:bCs/>
+          <w:sz w:val="28"/>
+          <w:szCs w:val="28"/>
+        </w:rPr>
+        <w:t xml:space="preserve">Menampilkan </w:t>
+      </w:r>
+      <w:r>
+        <w:rPr>
+          <w:rFonts w:ascii="Times New Roman" w:hAnsi="Times New Roman" w:cs="Times New Roman"/>
+          <w:b/>
+          <w:bCs/>
+          <w:i/>
+          <w:iCs/>
+          <w:sz w:val="28"/>
+          <w:szCs w:val="28"/>
+        </w:rPr>
+        <w:t>Engine</w:t>
+      </w:r>
+      <w:r>
+        <w:rPr>
+          <w:rFonts w:ascii="Times New Roman" w:hAnsi="Times New Roman" w:cs="Times New Roman"/>
+          <w:b/>
+          <w:bCs/>
+          <w:sz w:val="28"/>
+          <w:szCs w:val="28"/>
+        </w:rPr>
+        <w:t xml:space="preserve"> Yang Digunakan</w:t>
+      </w:r>
+    </w:p>
+    <w:p>
+      <w:pPr>
+        <w:rPr>
+          <w:rFonts w:ascii="Times New Roman" w:hAnsi="Times New Roman" w:cs="Times New Roman"/>
+          <w:sz w:val="24"/>
+          <w:szCs w:val="24"/>
+        </w:rPr>
+      </w:pPr>
+      <w:r>
+        <w:rPr>
+          <w:rFonts w:ascii="Times New Roman" w:hAnsi="Times New Roman" w:cs="Times New Roman"/>
+          <w:sz w:val="24"/>
+          <w:szCs w:val="24"/>
+        </w:rPr>
+        <w:drawing>
+          <wp:inline distT="0" distB="0" distL="0" distR="0">
+            <wp:extent cx="5731510" cy="1471930"/>
+            <wp:effectExtent l="0" t="0" r="2540" b="0"/>
+            <wp:docPr id="186617991" name="Picture 20"/>
+            <wp:cNvGraphicFramePr>
+              <a:graphicFrameLocks xmlns:a="http://schemas.openxmlformats.org/drawingml/2006/main" noChangeAspect="1"/>
+            </wp:cNvGraphicFramePr>
+            <a:graphic xmlns:a="http://schemas.openxmlformats.org/drawingml/2006/main">
+              <a:graphicData uri="http://schemas.openxmlformats.org/drawingml/2006/picture">
+                <pic:pic xmlns:pic="http://schemas.openxmlformats.org/drawingml/2006/picture">
+                  <pic:nvPicPr>
+                    <pic:cNvPr id="186617991" name="Picture 186617991"/>
+                    <pic:cNvPicPr/>
+                  </pic:nvPicPr>
+                  <pic:blipFill>
+                    <a:blip r:embed="rId49" cstate="print">
+                      <a:extLst>
+                        <a:ext uri="{28A0092B-C50C-407E-A947-70E740481C1C}">
+                          <a14:useLocalDpi xmlns:a14="http://schemas.microsoft.com/office/drawing/2010/main" val="0"/>
+                        </a:ext>
+                      </a:extLst>
+                    </a:blip>
+                    <a:stretch>
+                      <a:fillRect/>
+                    </a:stretch>
+                  </pic:blipFill>
+                  <pic:spPr>
+                    <a:xfrm>
+                      <a:off x="0" y="0"/>
+                      <a:ext cx="5731510" cy="1471930"/>
+                    </a:xfrm>
+                    <a:prstGeom prst="rect">
+                      <a:avLst/>
+                    </a:prstGeom>
+                  </pic:spPr>
+                </pic:pic>
+              </a:graphicData>
+            </a:graphic>
+          </wp:inline>
+        </w:drawing>
+      </w:r>
+    </w:p>
+    <w:p>
+      <w:pPr>
+        <w:rPr>
+          <w:rFonts w:ascii="Times New Roman" w:hAnsi="Times New Roman" w:cs="Times New Roman"/>
+          <w:b/>
+          <w:bCs/>
+          <w:sz w:val="24"/>
+          <w:szCs w:val="24"/>
+          <w:u w:val="single"/>
+        </w:rPr>
+      </w:pPr>
+      <w:r>
+        <w:rPr>
+          <w:rFonts w:ascii="Times New Roman" w:hAnsi="Times New Roman" w:cs="Times New Roman"/>
+          <w:b/>
+          <w:bCs/>
+          <w:sz w:val="24"/>
+          <w:szCs w:val="24"/>
+          <w:u w:val="single"/>
+        </w:rPr>
+        <w:t>Membuat Tabel tblorder:</w:t>
+      </w:r>
+    </w:p>
+    <w:p>
+      <w:pPr>
+        <w:rPr>
+          <w:rFonts w:ascii="Times New Roman" w:hAnsi="Times New Roman" w:cs="Times New Roman"/>
+          <w:sz w:val="24"/>
+          <w:szCs w:val="24"/>
+        </w:rPr>
+      </w:pPr>
+      <w:r>
+        <w:rPr>
+          <w:rFonts w:ascii="Times New Roman" w:hAnsi="Times New Roman" w:cs="Times New Roman"/>
+          <w:sz w:val="24"/>
+          <w:szCs w:val="24"/>
+        </w:rPr>
+        <w:t>Perintah untuk membuat tabel:</w:t>
+      </w:r>
+    </w:p>
+    <w:p>
+      <w:pPr>
+        <w:rPr>
+          <w:rFonts w:ascii="Times New Roman" w:hAnsi="Times New Roman" w:cs="Times New Roman"/>
+          <w:sz w:val="24"/>
+          <w:szCs w:val="24"/>
+        </w:rPr>
+      </w:pPr>
+      <w:r>
+        <w:rPr>
+          <w:rFonts w:ascii="Times New Roman" w:hAnsi="Times New Roman" w:cs="Times New Roman"/>
+          <w:sz w:val="24"/>
+          <w:szCs w:val="24"/>
+        </w:rPr>
+        <w:lastRenderedPageBreak/>
+        <w:drawing>
+          <wp:inline distT="0" distB="0" distL="0" distR="0">
+            <wp:extent cx="5531134" cy="2355971"/>
+            <wp:effectExtent l="0" t="0" r="0" b="6350"/>
+            <wp:docPr id="1667098983" name="Picture 21"/>
+            <wp:cNvGraphicFramePr>
+              <a:graphicFrameLocks xmlns:a="http://schemas.openxmlformats.org/drawingml/2006/main" noChangeAspect="1"/>
+            </wp:cNvGraphicFramePr>
+            <a:graphic xmlns:a="http://schemas.openxmlformats.org/drawingml/2006/main">
+              <a:graphicData uri="http://schemas.openxmlformats.org/drawingml/2006/picture">
+                <pic:pic xmlns:pic="http://schemas.openxmlformats.org/drawingml/2006/picture">
+                  <pic:nvPicPr>
+                    <pic:cNvPr id="1667098983" name="Picture 1667098983"/>
+                    <pic:cNvPicPr/>
+                  </pic:nvPicPr>
+                  <pic:blipFill>
+                    <a:blip r:embed="rId50">
+                      <a:extLst>
+                        <a:ext uri="{28A0092B-C50C-407E-A947-70E740481C1C}">
+                          <a14:useLocalDpi xmlns:a14="http://schemas.microsoft.com/office/drawing/2010/main" val="0"/>
+                        </a:ext>
+                      </a:extLst>
+                    </a:blip>
+                    <a:stretch>
+                      <a:fillRect/>
+                    </a:stretch>
+                  </pic:blipFill>
+                  <pic:spPr>
+                    <a:xfrm>
+                      <a:off x="0" y="0"/>
+                      <a:ext cx="5531134" cy="2355971"/>
+                    </a:xfrm>
+                    <a:prstGeom prst="rect">
+                      <a:avLst/>
+                    </a:prstGeom>
+                  </pic:spPr>
+                </pic:pic>
+              </a:graphicData>
+            </a:graphic>
+          </wp:inline>
+        </w:drawing>
+      </w:r>
+    </w:p>
+    <w:p>
+      <w:pPr>
+        <w:rPr>
+          <w:rFonts w:ascii="Times New Roman" w:hAnsi="Times New Roman" w:cs="Times New Roman"/>
+          <w:sz w:val="24"/>
+          <w:szCs w:val="24"/>
+        </w:rPr>
+      </w:pPr>
+      <w:r>
+        <w:rPr>
+          <w:rFonts w:ascii="Times New Roman" w:hAnsi="Times New Roman" w:cs="Times New Roman"/>
+          <w:sz w:val="24"/>
+          <w:szCs w:val="24"/>
+        </w:rPr>
+        <w:t>Hasil pembuatan tabel tblorder:</w:t>
+      </w:r>
+    </w:p>
+    <w:p>
+      <w:pPr>
+        <w:rPr>
+          <w:rFonts w:ascii="Times New Roman" w:hAnsi="Times New Roman" w:cs="Times New Roman"/>
+          <w:sz w:val="24"/>
+          <w:szCs w:val="24"/>
+        </w:rPr>
+      </w:pPr>
+      <w:r>
+        <w:rPr>
+          <w:rFonts w:ascii="Times New Roman" w:hAnsi="Times New Roman" w:cs="Times New Roman"/>
+          <w:sz w:val="24"/>
+          <w:szCs w:val="24"/>
+        </w:rPr>
+        <w:drawing>
+          <wp:inline distT="0" distB="0" distL="0" distR="0">
+            <wp:extent cx="5575587" cy="2419474"/>
+            <wp:effectExtent l="0" t="0" r="6350" b="0"/>
+            <wp:docPr id="684276180" name="Picture 22"/>
+            <wp:cNvGraphicFramePr>
+              <a:graphicFrameLocks xmlns:a="http://schemas.openxmlformats.org/drawingml/2006/main" noChangeAspect="1"/>
+            </wp:cNvGraphicFramePr>
+            <a:graphic xmlns:a="http://schemas.openxmlformats.org/drawingml/2006/main">
+              <a:graphicData uri="http://schemas.openxmlformats.org/drawingml/2006/picture">
+                <pic:pic xmlns:pic="http://schemas.openxmlformats.org/drawingml/2006/picture">
+                  <pic:nvPicPr>
+                    <pic:cNvPr id="684276180" name="Picture 684276180"/>
+                    <pic:cNvPicPr/>
+                  </pic:nvPicPr>
+                  <pic:blipFill>
+                    <a:blip r:embed="rId51">
+                      <a:extLst>
+                        <a:ext uri="{28A0092B-C50C-407E-A947-70E740481C1C}">
+                          <a14:useLocalDpi xmlns:a14="http://schemas.microsoft.com/office/drawing/2010/main" val="0"/>
+                        </a:ext>
+                      </a:extLst>
+                    </a:blip>
+                    <a:stretch>
+                      <a:fillRect/>
+                    </a:stretch>
+                  </pic:blipFill>
+                  <pic:spPr>
+                    <a:xfrm>
+                      <a:off x="0" y="0"/>
+                      <a:ext cx="5575587" cy="2419474"/>
+                    </a:xfrm>
+                    <a:prstGeom prst="rect">
+                      <a:avLst/>
+                    </a:prstGeom>
+                  </pic:spPr>
+                </pic:pic>
+              </a:graphicData>
+            </a:graphic>
+          </wp:inline>
+        </w:drawing>
+      </w:r>
+    </w:p>
+    <w:p>
+      <w:pPr>
+        <w:rPr>
+          <w:rFonts w:ascii="Times New Roman" w:hAnsi="Times New Roman" w:cs="Times New Roman"/>
+          <w:sz w:val="24"/>
+          <w:szCs w:val="24"/>
+        </w:rPr>
+      </w:pPr>
+    </w:p>
+    <w:p>
+      <w:pPr>
+        <w:rPr>
+          <w:rFonts w:ascii="Times New Roman" w:hAnsi="Times New Roman" w:cs="Times New Roman"/>
+          <w:b/>
+          <w:bCs/>
+          <w:sz w:val="28"/>
+          <w:szCs w:val="28"/>
+        </w:rPr>
+      </w:pPr>
+      <w:r>
+        <w:rPr>
+          <w:rFonts w:ascii="Times New Roman" w:hAnsi="Times New Roman" w:cs="Times New Roman"/>
+          <w:b/>
+          <w:bCs/>
+          <w:sz w:val="28"/>
+          <w:szCs w:val="28"/>
+        </w:rPr>
+        <w:t>Menambah Kolom Setelah Kolom</w:t>
+      </w:r>
+    </w:p>
+    <w:p>
+      <w:pPr>
+        <w:rPr>
+          <w:rFonts w:ascii="Times New Roman" w:hAnsi="Times New Roman" w:cs="Times New Roman"/>
+          <w:b/>
+          <w:bCs/>
+          <w:sz w:val="28"/>
+          <w:szCs w:val="28"/>
+        </w:rPr>
+      </w:pPr>
+      <w:r>
+        <w:rPr>
+          <w:rFonts w:ascii="Times New Roman" w:hAnsi="Times New Roman" w:cs="Times New Roman"/>
+          <w:b/>
+          <w:bCs/>
+          <w:sz w:val="28"/>
+          <w:szCs w:val="28"/>
+        </w:rPr>
+        <w:drawing>
+          <wp:inline distT="0" distB="0" distL="0" distR="0">
+            <wp:extent cx="5731510" cy="1023620"/>
+            <wp:effectExtent l="0" t="0" r="2540" b="5080"/>
+            <wp:docPr id="1230772433" name="Picture 23"/>
+            <wp:cNvGraphicFramePr>
+              <a:graphicFrameLocks xmlns:a="http://schemas.openxmlformats.org/drawingml/2006/main" noChangeAspect="1"/>
+            </wp:cNvGraphicFramePr>
+            <a:graphic xmlns:a="http://schemas.openxmlformats.org/drawingml/2006/main">
+              <a:graphicData uri="http://schemas.openxmlformats.org/drawingml/2006/picture">
+                <pic:pic xmlns:pic="http://schemas.openxmlformats.org/drawingml/2006/picture">
+                  <pic:nvPicPr>
+                    <pic:cNvPr id="1230772433" name="Picture 1230772433"/>
+                    <pic:cNvPicPr/>
+                  </pic:nvPicPr>
+                  <pic:blipFill>
+                    <a:blip r:embed="rId52">
+                      <a:extLst>
+                        <a:ext uri="{28A0092B-C50C-407E-A947-70E740481C1C}">
+                          <a14:useLocalDpi xmlns:a14="http://schemas.microsoft.com/office/drawing/2010/main" val="0"/>
+                        </a:ext>
+                      </a:extLst>
+                    </a:blip>
+                    <a:stretch>
+                      <a:fillRect/>
+                    </a:stretch>
+                  </pic:blipFill>
+                  <pic:spPr>
+                    <a:xfrm>
+                      <a:off x="0" y="0"/>
+                      <a:ext cx="5731510" cy="1023620"/>
+                    </a:xfrm>
+                    <a:prstGeom prst="rect">
+                      <a:avLst/>
+                    </a:prstGeom>
+                  </pic:spPr>
+                </pic:pic>
+              </a:graphicData>
+            </a:graphic>
+          </wp:inline>
+        </w:drawing>
+      </w:r>
+    </w:p>
+    <w:p>
+      <w:pPr>
+        <w:rPr>
+          <w:rFonts w:ascii="Times New Roman" w:hAnsi="Times New Roman" w:cs="Times New Roman"/>
+          <w:sz w:val="24"/>
+          <w:szCs w:val="24"/>
+        </w:rPr>
+      </w:pPr>
+      <w:r>
+        <w:rPr>
+          <w:rFonts w:ascii="Times New Roman" w:hAnsi="Times New Roman" w:cs="Times New Roman"/>
+          <w:sz w:val="24"/>
+          <w:szCs w:val="24"/>
+        </w:rPr>
+        <w:t>Hasil:</w:t>
+      </w:r>
+    </w:p>
+    <w:p>
+      <w:pPr>
+        <w:rPr>
+          <w:rFonts w:ascii="Times New Roman" w:hAnsi="Times New Roman" w:cs="Times New Roman"/>
+          <w:sz w:val="24"/>
+          <w:szCs w:val="24"/>
+        </w:rPr>
+      </w:pPr>
+      <w:r>
+        <w:rPr>
+          <w:rFonts w:ascii="Times New Roman" w:hAnsi="Times New Roman" w:cs="Times New Roman"/>
+          <w:sz w:val="24"/>
+          <w:szCs w:val="24"/>
+        </w:rPr>
+        <w:lastRenderedPageBreak/>
+        <w:drawing>
+          <wp:inline distT="0" distB="0" distL="0" distR="0">
+            <wp:extent cx="5731510" cy="2382520"/>
+            <wp:effectExtent l="0" t="0" r="2540" b="0"/>
+            <wp:docPr id="1277814294" name="Picture 24"/>
+            <wp:cNvGraphicFramePr>
+              <a:graphicFrameLocks xmlns:a="http://schemas.openxmlformats.org/drawingml/2006/main" noChangeAspect="1"/>
+            </wp:cNvGraphicFramePr>
+            <a:graphic xmlns:a="http://schemas.openxmlformats.org/drawingml/2006/main">
+              <a:graphicData uri="http://schemas.openxmlformats.org/drawingml/2006/picture">
+                <pic:pic xmlns:pic="http://schemas.openxmlformats.org/drawingml/2006/picture">
+                  <pic:nvPicPr>
+                    <pic:cNvPr id="1277814294" name="Picture 1277814294"/>
+                    <pic:cNvPicPr/>
+                  </pic:nvPicPr>
+                  <pic:blipFill>
+                    <a:blip r:embed="rId53">
+                      <a:extLst>
+                        <a:ext uri="{28A0092B-C50C-407E-A947-70E740481C1C}">
+                          <a14:useLocalDpi xmlns:a14="http://schemas.microsoft.com/office/drawing/2010/main" val="0"/>
+                        </a:ext>
+                      </a:extLst>
+                    </a:blip>
+                    <a:stretch>
+                      <a:fillRect/>
+                    </a:stretch>
+                  </pic:blipFill>
+                  <pic:spPr>
+                    <a:xfrm>
+                      <a:off x="0" y="0"/>
+                      <a:ext cx="5731510" cy="2382520"/>
+                    </a:xfrm>
+                    <a:prstGeom prst="rect">
+                      <a:avLst/>
+                    </a:prstGeom>
+                  </pic:spPr>
+                </pic:pic>
+              </a:graphicData>
+            </a:graphic>
+          </wp:inline>
+        </w:drawing>
+      </w:r>
+    </w:p>
+    <w:p>
+      <w:pPr>
+        <w:rPr>
+          <w:rFonts w:ascii="Times New Roman" w:hAnsi="Times New Roman" w:cs="Times New Roman"/>
+          <w:b/>
+          <w:bCs/>
+          <w:sz w:val="24"/>
+          <w:szCs w:val="24"/>
+          <w:u w:val="single"/>
+        </w:rPr>
+      </w:pPr>
+      <w:r>
+        <w:rPr>
+          <w:rFonts w:ascii="Times New Roman" w:hAnsi="Times New Roman" w:cs="Times New Roman"/>
+          <w:b/>
+          <w:bCs/>
+          <w:sz w:val="24"/>
+          <w:szCs w:val="24"/>
+          <w:u w:val="single"/>
+        </w:rPr>
+        <w:t>Membuat Tabel tblorderdetail:</w:t>
+      </w:r>
+    </w:p>
+    <w:p>
+      <w:pPr>
+        <w:rPr>
+          <w:rFonts w:ascii="Times New Roman" w:hAnsi="Times New Roman" w:cs="Times New Roman"/>
+          <w:b/>
+          <w:bCs/>
+          <w:sz w:val="24"/>
+          <w:szCs w:val="24"/>
+          <w:u w:val="single"/>
+        </w:rPr>
+      </w:pPr>
+      <w:r>
+        <w:rPr>
+          <w:rFonts w:ascii="Times New Roman" w:hAnsi="Times New Roman" w:cs="Times New Roman"/>
+          <w:b/>
+          <w:bCs/>
+          <w:sz w:val="24"/>
+          <w:szCs w:val="24"/>
+          <w:u w:val="single"/>
+        </w:rPr>
+        <w:drawing>
+          <wp:inline distT="0" distB="0" distL="0" distR="0">
+            <wp:extent cx="4845299" cy="2197213"/>
+            <wp:effectExtent l="0" t="0" r="0" b="0"/>
+            <wp:docPr id="1354027833" name="Picture 25"/>
+            <wp:cNvGraphicFramePr>
+              <a:graphicFrameLocks xmlns:a="http://schemas.openxmlformats.org/drawingml/2006/main" noChangeAspect="1"/>
+            </wp:cNvGraphicFramePr>
+            <a:graphic xmlns:a="http://schemas.openxmlformats.org/drawingml/2006/main">
+              <a:graphicData uri="http://schemas.openxmlformats.org/drawingml/2006/picture">
+                <pic:pic xmlns:pic="http://schemas.openxmlformats.org/drawingml/2006/picture">
+                  <pic:nvPicPr>
+                    <pic:cNvPr id="1354027833" name="Picture 1354027833"/>
+                    <pic:cNvPicPr/>
+                  </pic:nvPicPr>
+                  <pic:blipFill>
+                    <a:blip r:embed="rId54">
+                      <a:extLst>
+                        <a:ext uri="{28A0092B-C50C-407E-A947-70E740481C1C}">
+                          <a14:useLocalDpi xmlns:a14="http://schemas.microsoft.com/office/drawing/2010/main" val="0"/>
+                        </a:ext>
+                      </a:extLst>
+                    </a:blip>
+                    <a:stretch>
+                      <a:fillRect/>
+                    </a:stretch>
+                  </pic:blipFill>
+                  <pic:spPr>
+                    <a:xfrm>
+                      <a:off x="0" y="0"/>
+                      <a:ext cx="4845299" cy="2197213"/>
+                    </a:xfrm>
+                    <a:prstGeom prst="rect">
+                      <a:avLst/>
+                    </a:prstGeom>
+                  </pic:spPr>
+                </pic:pic>
+              </a:graphicData>
+            </a:graphic>
+          </wp:inline>
+        </w:drawing>
+      </w:r>
+    </w:p>
+    <w:p>
+      <w:pPr>
+        <w:rPr>
+          <w:rFonts w:ascii="Times New Roman" w:hAnsi="Times New Roman" w:cs="Times New Roman"/>
+          <w:sz w:val="24"/>
+          <w:szCs w:val="24"/>
+        </w:rPr>
+      </w:pPr>
+      <w:r>
+        <w:rPr>
+          <w:rFonts w:ascii="Times New Roman" w:hAnsi="Times New Roman" w:cs="Times New Roman"/>
+          <w:sz w:val="24"/>
+          <w:szCs w:val="24"/>
+        </w:rPr>
+        <w:t>Struktur tabel tblorderdetail:</w:t>
+      </w:r>
+    </w:p>
+    <w:p>
+      <w:pPr>
+        <w:rPr>
+          <w:rFonts w:ascii="Times New Roman" w:hAnsi="Times New Roman" w:cs="Times New Roman"/>
+          <w:sz w:val="24"/>
+          <w:szCs w:val="24"/>
+        </w:rPr>
+      </w:pPr>
+      <w:r>
+        <w:rPr>
+          <w:rFonts w:ascii="Times New Roman" w:hAnsi="Times New Roman" w:cs="Times New Roman"/>
+          <w:sz w:val="24"/>
+          <w:szCs w:val="24"/>
+        </w:rPr>
+        <w:drawing>
+          <wp:inline distT="0" distB="0" distL="0" distR="0">
+            <wp:extent cx="5143764" cy="2394073"/>
+            <wp:effectExtent l="0" t="0" r="0" b="6350"/>
+            <wp:docPr id="1289928762" name="Picture 26"/>
+            <wp:cNvGraphicFramePr>
+              <a:graphicFrameLocks xmlns:a="http://schemas.openxmlformats.org/drawingml/2006/main" noChangeAspect="1"/>
+            </wp:cNvGraphicFramePr>
+            <a:graphic xmlns:a="http://schemas.openxmlformats.org/drawingml/2006/main">
+              <a:graphicData uri="http://schemas.openxmlformats.org/drawingml/2006/picture">
+                <pic:pic xmlns:pic="http://schemas.openxmlformats.org/drawingml/2006/picture">
+                  <pic:nvPicPr>
+                    <pic:cNvPr id="1289928762" name="Picture 1289928762"/>
+                    <pic:cNvPicPr/>
+                  </pic:nvPicPr>
+                  <pic:blipFill>
+                    <a:blip r:embed="rId55">
+                      <a:extLst>
+                        <a:ext uri="{28A0092B-C50C-407E-A947-70E740481C1C}">
+                          <a14:useLocalDpi xmlns:a14="http://schemas.microsoft.com/office/drawing/2010/main" val="0"/>
+                        </a:ext>
+                      </a:extLst>
+                    </a:blip>
+                    <a:stretch>
+                      <a:fillRect/>
+                    </a:stretch>
+                  </pic:blipFill>
+                  <pic:spPr>
+                    <a:xfrm>
+                      <a:off x="0" y="0"/>
+                      <a:ext cx="5143764" cy="2394073"/>
+                    </a:xfrm>
+                    <a:prstGeom prst="rect">
+                      <a:avLst/>
+                    </a:prstGeom>
+                  </pic:spPr>
+                </pic:pic>
+              </a:graphicData>
+            </a:graphic>
+          </wp:inline>
+        </w:drawing>
+      </w:r>
+    </w:p>
+    <w:p>
+      <w:pPr>
+        <w:rPr>
+          <w:rFonts w:ascii="Times New Roman" w:hAnsi="Times New Roman" w:cs="Times New Roman"/>
+          <w:b/>
+          <w:bCs/>
+          <w:sz w:val="28"/>
+          <w:szCs w:val="28"/>
+        </w:rPr>
+      </w:pPr>
+    </w:p>
+    <w:p>
+      <w:pPr>
+        <w:rPr>
+          <w:rFonts w:ascii="Times New Roman" w:hAnsi="Times New Roman" w:cs="Times New Roman"/>
+          <w:b/>
+          <w:bCs/>
+          <w:sz w:val="28"/>
+          <w:szCs w:val="28"/>
+        </w:rPr>
+      </w:pPr>
+      <w:r>
+        <w:rPr>
+          <w:rFonts w:ascii="Times New Roman" w:hAnsi="Times New Roman" w:cs="Times New Roman"/>
+          <w:b/>
+          <w:bCs/>
+          <w:sz w:val="28"/>
+          <w:szCs w:val="28"/>
+        </w:rPr>
+        <w:t>Membuat Index</w:t>
+      </w:r>
+    </w:p>
+    <w:p>
+      <w:pPr>
+        <w:rPr>
+          <w:rFonts w:ascii="Times New Roman" w:hAnsi="Times New Roman" w:cs="Times New Roman"/>
+          <w:sz w:val="24"/>
+          <w:szCs w:val="24"/>
+        </w:rPr>
+      </w:pPr>
+      <w:r>
+        <w:rPr>
+          <w:rFonts w:ascii="Times New Roman" w:hAnsi="Times New Roman" w:cs="Times New Roman"/>
+          <w:sz w:val="24"/>
+          <w:szCs w:val="24"/>
+        </w:rPr>
+        <w:lastRenderedPageBreak/>
+        <w:t>Index pada MySQL ialah suatu syntax yang dapat digunakan untuk mempercepat proses pencarian data agar tidak memakan waktu yang lama</w:t>
+      </w:r>
+    </w:p>
+    <w:p>
+      <w:pPr>
+        <w:rPr>
+          <w:rFonts w:ascii="Times New Roman" w:hAnsi="Times New Roman" w:cs="Times New Roman"/>
+          <w:sz w:val="24"/>
+          <w:szCs w:val="24"/>
+        </w:rPr>
+      </w:pPr>
+      <w:r>
+        <w:rPr>
+          <w:rFonts w:ascii="Times New Roman" w:hAnsi="Times New Roman" w:cs="Times New Roman"/>
+          <w:sz w:val="24"/>
+          <w:szCs w:val="24"/>
+        </w:rPr>
+        <w:drawing>
+          <wp:inline distT="0" distB="0" distL="0" distR="0">
+            <wp:extent cx="5505733" cy="2165461"/>
+            <wp:effectExtent l="0" t="0" r="0" b="6350"/>
+            <wp:docPr id="201561547" name="Picture 27"/>
+            <wp:cNvGraphicFramePr>
+              <a:graphicFrameLocks xmlns:a="http://schemas.openxmlformats.org/drawingml/2006/main" noChangeAspect="1"/>
+            </wp:cNvGraphicFramePr>
+            <a:graphic xmlns:a="http://schemas.openxmlformats.org/drawingml/2006/main">
+              <a:graphicData uri="http://schemas.openxmlformats.org/drawingml/2006/picture">
+                <pic:pic xmlns:pic="http://schemas.openxmlformats.org/drawingml/2006/picture">
+                  <pic:nvPicPr>
+                    <pic:cNvPr id="201561547" name="Picture 201561547"/>
+                    <pic:cNvPicPr/>
+                  </pic:nvPicPr>
+                  <pic:blipFill>
+                    <a:blip r:embed="rId56">
+                      <a:extLst>
+                        <a:ext uri="{28A0092B-C50C-407E-A947-70E740481C1C}">
+                          <a14:useLocalDpi xmlns:a14="http://schemas.microsoft.com/office/drawing/2010/main" val="0"/>
+                        </a:ext>
+                      </a:extLst>
+                    </a:blip>
+                    <a:stretch>
+                      <a:fillRect/>
+                    </a:stretch>
+                  </pic:blipFill>
+                  <pic:spPr>
+                    <a:xfrm>
+                      <a:off x="0" y="0"/>
+                      <a:ext cx="5505733" cy="2165461"/>
+                    </a:xfrm>
+                    <a:prstGeom prst="rect">
+                      <a:avLst/>
+                    </a:prstGeom>
+                  </pic:spPr>
+                </pic:pic>
+              </a:graphicData>
+            </a:graphic>
+          </wp:inline>
+        </w:drawing>
+      </w:r>
+    </w:p>
+    <w:p>
+      <w:pPr>
+        <w:rPr>
+          <w:rFonts w:ascii="Times New Roman" w:hAnsi="Times New Roman" w:cs="Times New Roman"/>
+          <w:sz w:val="24"/>
+          <w:szCs w:val="24"/>
+        </w:rPr>
+      </w:pPr>
+      <w:r>
+        <w:rPr>
+          <w:rFonts w:ascii="Times New Roman" w:hAnsi="Times New Roman" w:cs="Times New Roman"/>
+          <w:sz w:val="24"/>
+          <w:szCs w:val="24"/>
+        </w:rPr>
+        <w:t>Buat index untuk tabel tblbarang:</w:t>
+      </w:r>
+    </w:p>
+    <w:p>
+      <w:pPr>
+        <w:rPr>
+          <w:rFonts w:ascii="Times New Roman" w:hAnsi="Times New Roman" w:cs="Times New Roman"/>
+          <w:sz w:val="24"/>
+          <w:szCs w:val="24"/>
+        </w:rPr>
+      </w:pPr>
+      <w:r>
+        <w:rPr>
+          <w:rFonts w:ascii="Times New Roman" w:hAnsi="Times New Roman" w:cs="Times New Roman"/>
+          <w:sz w:val="24"/>
+          <w:szCs w:val="24"/>
+        </w:rPr>
+        <w:drawing>
+          <wp:inline distT="0" distB="0" distL="0" distR="0">
+            <wp:extent cx="5397777" cy="2025754"/>
+            <wp:effectExtent l="0" t="0" r="0" b="0"/>
+            <wp:docPr id="747322131" name="Picture 28"/>
+            <wp:cNvGraphicFramePr>
+              <a:graphicFrameLocks xmlns:a="http://schemas.openxmlformats.org/drawingml/2006/main" noChangeAspect="1"/>
+            </wp:cNvGraphicFramePr>
+            <a:graphic xmlns:a="http://schemas.openxmlformats.org/drawingml/2006/main">
+              <a:graphicData uri="http://schemas.openxmlformats.org/drawingml/2006/picture">
+                <pic:pic xmlns:pic="http://schemas.openxmlformats.org/drawingml/2006/picture">
+                  <pic:nvPicPr>
+                    <pic:cNvPr id="747322131" name="Picture 747322131"/>
+                    <pic:cNvPicPr/>
+                  </pic:nvPicPr>
+                  <pic:blipFill>
+                    <a:blip r:embed="rId57">
+                      <a:extLst>
+                        <a:ext uri="{28A0092B-C50C-407E-A947-70E740481C1C}">
+                          <a14:useLocalDpi xmlns:a14="http://schemas.microsoft.com/office/drawing/2010/main" val="0"/>
+                        </a:ext>
+                      </a:extLst>
+                    </a:blip>
+                    <a:stretch>
+                      <a:fillRect/>
+                    </a:stretch>
+                  </pic:blipFill>
+                  <pic:spPr>
+                    <a:xfrm>
+                      <a:off x="0" y="0"/>
+                      <a:ext cx="5397777" cy="2025754"/>
+                    </a:xfrm>
+                    <a:prstGeom prst="rect">
+                      <a:avLst/>
+                    </a:prstGeom>
+                  </pic:spPr>
+                </pic:pic>
+              </a:graphicData>
+            </a:graphic>
+          </wp:inline>
+        </w:drawing>
+      </w:r>
+    </w:p>
+    <w:p>
+      <w:pPr>
+        <w:rPr>
+          <w:rFonts w:ascii="Times New Roman" w:hAnsi="Times New Roman" w:cs="Times New Roman"/>
+          <w:sz w:val="24"/>
+          <w:szCs w:val="24"/>
+        </w:rPr>
+      </w:pPr>
+    </w:p>
+    <w:p>
+      <w:pPr>
+        <w:rPr>
+          <w:rFonts w:ascii="Times New Roman" w:hAnsi="Times New Roman" w:cs="Times New Roman"/>
+          <w:b/>
+          <w:bCs/>
+          <w:sz w:val="28"/>
+          <w:szCs w:val="28"/>
+        </w:rPr>
+      </w:pPr>
+      <w:r>
+        <w:rPr>
+          <w:rFonts w:ascii="Times New Roman" w:hAnsi="Times New Roman" w:cs="Times New Roman"/>
+          <w:b/>
+          <w:bCs/>
+          <w:sz w:val="28"/>
+          <w:szCs w:val="28"/>
+        </w:rPr>
+        <w:t>Menampilkan Index</w:t>
+      </w:r>
+    </w:p>
+    <w:p>
+      <w:pPr>
+        <w:rPr>
+          <w:rFonts w:ascii="Times New Roman" w:hAnsi="Times New Roman" w:cs="Times New Roman"/>
+          <w:b/>
+          <w:bCs/>
+          <w:sz w:val="28"/>
+          <w:szCs w:val="28"/>
+        </w:rPr>
+      </w:pPr>
+      <w:r>
+        <w:rPr>
+          <w:rFonts w:ascii="Times New Roman" w:hAnsi="Times New Roman" w:cs="Times New Roman"/>
+          <w:b/>
+          <w:bCs/>
+          <w:sz w:val="28"/>
+          <w:szCs w:val="28"/>
+        </w:rPr>
+        <w:drawing>
+          <wp:inline distT="0" distB="0" distL="0" distR="0">
+            <wp:extent cx="5731510" cy="1051560"/>
+            <wp:effectExtent l="0" t="0" r="2540" b="0"/>
+            <wp:docPr id="866838498" name="Picture 29"/>
+            <wp:cNvGraphicFramePr>
+              <a:graphicFrameLocks xmlns:a="http://schemas.openxmlformats.org/drawingml/2006/main" noChangeAspect="1"/>
+            </wp:cNvGraphicFramePr>
+            <a:graphic xmlns:a="http://schemas.openxmlformats.org/drawingml/2006/main">
+              <a:graphicData uri="http://schemas.openxmlformats.org/drawingml/2006/picture">
+                <pic:pic xmlns:pic="http://schemas.openxmlformats.org/drawingml/2006/picture">
+                  <pic:nvPicPr>
+                    <pic:cNvPr id="866838498" name="Picture 866838498"/>
+                    <pic:cNvPicPr/>
+                  </pic:nvPicPr>
+                  <pic:blipFill>
+                    <a:blip r:embed="rId58" cstate="print">
+                      <a:extLst>
+                        <a:ext uri="{28A0092B-C50C-407E-A947-70E740481C1C}">
+                          <a14:useLocalDpi xmlns:a14="http://schemas.microsoft.com/office/drawing/2010/main" val="0"/>
+                        </a:ext>
+                      </a:extLst>
+                    </a:blip>
+                    <a:stretch>
+                      <a:fillRect/>
+                    </a:stretch>
+                  </pic:blipFill>
+                  <pic:spPr>
+                    <a:xfrm>
+                      <a:off x="0" y="0"/>
+                      <a:ext cx="5731510" cy="1051560"/>
+                    </a:xfrm>
+                    <a:prstGeom prst="rect">
+                      <a:avLst/>
+                    </a:prstGeom>
+                  </pic:spPr>
+                </pic:pic>
+              </a:graphicData>
+            </a:graphic>
+          </wp:inline>
+        </w:drawing>
+      </w:r>
+    </w:p>
+    <w:p>
+      <w:pPr>
+        <w:rPr>
+          <w:rFonts w:ascii="Times New Roman" w:hAnsi="Times New Roman" w:cs="Times New Roman"/>
+          <w:b/>
+          <w:bCs/>
+          <w:sz w:val="28"/>
+          <w:szCs w:val="28"/>
+        </w:rPr>
+      </w:pPr>
+    </w:p>
+    <w:p>
+      <w:pPr>
+        <w:rPr>
+          <w:rFonts w:ascii="Times New Roman" w:hAnsi="Times New Roman" w:cs="Times New Roman"/>
+          <w:b/>
+          <w:bCs/>
+          <w:sz w:val="28"/>
+          <w:szCs w:val="28"/>
+        </w:rPr>
+      </w:pPr>
+      <w:r>
+        <w:rPr>
+          <w:rFonts w:ascii="Times New Roman" w:hAnsi="Times New Roman" w:cs="Times New Roman"/>
+          <w:b/>
+          <w:bCs/>
+          <w:sz w:val="28"/>
+          <w:szCs w:val="28"/>
+        </w:rPr>
+        <w:t>Menghapus Index</w:t>
+      </w:r>
+    </w:p>
+    <w:p>
+      <w:pPr>
+        <w:rPr>
+          <w:rFonts w:ascii="Times New Roman" w:hAnsi="Times New Roman" w:cs="Times New Roman"/>
+          <w:b/>
+          <w:bCs/>
+          <w:sz w:val="28"/>
+          <w:szCs w:val="28"/>
+        </w:rPr>
+      </w:pPr>
+      <w:r>
+        <w:rPr>
+          <w:rFonts w:ascii="Times New Roman" w:hAnsi="Times New Roman" w:cs="Times New Roman"/>
+          <w:b/>
+          <w:bCs/>
+          <w:sz w:val="28"/>
+          <w:szCs w:val="28"/>
+        </w:rPr>
+        <w:lastRenderedPageBreak/>
+        <w:drawing>
+          <wp:inline distT="0" distB="0" distL="0" distR="0">
+            <wp:extent cx="5213618" cy="1409772"/>
+            <wp:effectExtent l="0" t="0" r="6350" b="0"/>
+            <wp:docPr id="604780049" name="Picture 30"/>
+            <wp:cNvGraphicFramePr>
+              <a:graphicFrameLocks xmlns:a="http://schemas.openxmlformats.org/drawingml/2006/main" noChangeAspect="1"/>
+            </wp:cNvGraphicFramePr>
+            <a:graphic xmlns:a="http://schemas.openxmlformats.org/drawingml/2006/main">
+              <a:graphicData uri="http://schemas.openxmlformats.org/drawingml/2006/picture">
+                <pic:pic xmlns:pic="http://schemas.openxmlformats.org/drawingml/2006/picture">
+                  <pic:nvPicPr>
+                    <pic:cNvPr id="604780049" name="Picture 604780049"/>
+                    <pic:cNvPicPr/>
+                  </pic:nvPicPr>
+                  <pic:blipFill>
+                    <a:blip r:embed="rId59">
+                      <a:extLst>
+                        <a:ext uri="{28A0092B-C50C-407E-A947-70E740481C1C}">
+                          <a14:useLocalDpi xmlns:a14="http://schemas.microsoft.com/office/drawing/2010/main" val="0"/>
+                        </a:ext>
+                      </a:extLst>
+                    </a:blip>
+                    <a:stretch>
+                      <a:fillRect/>
+                    </a:stretch>
+                  </pic:blipFill>
+                  <pic:spPr>
+                    <a:xfrm>
+                      <a:off x="0" y="0"/>
+                      <a:ext cx="5213618" cy="1409772"/>
+                    </a:xfrm>
+                    <a:prstGeom prst="rect">
+                      <a:avLst/>
+                    </a:prstGeom>
+                  </pic:spPr>
+                </pic:pic>
+              </a:graphicData>
+            </a:graphic>
+          </wp:inline>
+        </w:drawing>
+      </w:r>
     </w:p>
     <w:sectPr>
       <w:pgSz w:w="11906" w:h="16838"/>

</xml_diff>